<commit_message>
Record assessment decisions from reviewed DOCX
</commit_message>
<xml_diff>
--- a/docs/citation-bot-talk-findings.docx
+++ b/docs/citation-bot-talk-findings.docx
@@ -54,27 +54,7 @@
           <w:sz w:val="18"/>
           <w:lang w:val="en-US"/>
         </w:rPr>
-        <w:t xml:space="preserve">Scope: current unarchived User </w:t>
-      </w:r>
-      <w:proofErr w:type="spellStart"/>
-      <w:proofErr w:type="gramStart"/>
-      <w:r>
-        <w:rPr>
-          <w:rFonts w:ascii="Calibri" w:hAnsi="Calibri"/>
-          <w:sz w:val="18"/>
-          <w:lang w:val="en-US"/>
-        </w:rPr>
-        <w:t>talk:Citation</w:t>
-      </w:r>
-      <w:proofErr w:type="spellEnd"/>
-      <w:proofErr w:type="gramEnd"/>
-      <w:r>
-        <w:rPr>
-          <w:rFonts w:ascii="Calibri" w:hAnsi="Calibri"/>
-          <w:sz w:val="18"/>
-          <w:lang w:val="en-US"/>
-        </w:rPr>
-        <w:t xml:space="preserve"> bot only. Code: upstream/master f5125dc75. Use final column for your manual result.</w:t>
+        <w:t>Scope: current unarchived User talk:Citation bot only. Code: upstream/master f5125dc75. Use final column for your manual result.</w:t>
       </w:r>
     </w:p>
     <w:p>
@@ -100,18 +80,8 @@
           <w:b/>
           <w:sz w:val="28"/>
         </w:rPr>
-        <w:t xml:space="preserve">Report </w:t>
+        <w:t>Report Worksheet</w:t>
       </w:r>
-      <w:proofErr w:type="spellStart"/>
-      <w:r>
-        <w:rPr>
-          <w:rFonts w:ascii="Calibri" w:hAnsi="Calibri"/>
-          <w:b/>
-          <w:sz w:val="28"/>
-        </w:rPr>
-        <w:t>Worksheet</w:t>
-      </w:r>
-      <w:proofErr w:type="spellEnd"/>
     </w:p>
     <w:tbl>
       <w:tblPr>
@@ -177,148 +147,52 @@
                 <w:b/>
                 <w:sz w:val="16"/>
               </w:rPr>
-              <w:t xml:space="preserve">Report </w:t>
-            </w:r>
-            <w:proofErr w:type="spellStart"/>
-            <w:r>
+              <w:t>Report and evidence</w:t>
+            </w:r>
+          </w:p>
+        </w:tc>
+        <w:tc>
+          <w:tcPr>
+            <w:tcW w:w="1159" w:type="pct"/>
+          </w:tcPr>
+          <w:p>
+            <w:pPr>
               <w:rPr>
                 <w:rFonts w:ascii="Calibri" w:hAnsi="Calibri" w:cs="Calibri"/>
                 <w:b/>
                 <w:sz w:val="16"/>
               </w:rPr>
-              <w:t>and</w:t>
-            </w:r>
-            <w:proofErr w:type="spellEnd"/>
+            </w:pPr>
             <w:r>
               <w:rPr>
                 <w:rFonts w:ascii="Calibri" w:hAnsi="Calibri" w:cs="Calibri"/>
                 <w:b/>
                 <w:sz w:val="16"/>
               </w:rPr>
-              <w:t xml:space="preserve"> </w:t>
-            </w:r>
-            <w:proofErr w:type="spellStart"/>
-            <w:r>
+              <w:t>Provisional result</w:t>
+            </w:r>
+          </w:p>
+        </w:tc>
+        <w:tc>
+          <w:tcPr>
+            <w:tcW w:w="1161" w:type="pct"/>
+          </w:tcPr>
+          <w:p>
+            <w:pPr>
               <w:rPr>
                 <w:rFonts w:ascii="Calibri" w:hAnsi="Calibri" w:cs="Calibri"/>
                 <w:b/>
                 <w:sz w:val="16"/>
               </w:rPr>
-              <w:t>evidence</w:t>
-            </w:r>
-            <w:proofErr w:type="spellEnd"/>
-          </w:p>
-        </w:tc>
-        <w:tc>
-          <w:tcPr>
-            <w:tcW w:w="1159" w:type="pct"/>
-          </w:tcPr>
-          <w:p>
-            <w:pPr>
+            </w:pPr>
+            <w:r>
               <w:rPr>
                 <w:rFonts w:ascii="Calibri" w:hAnsi="Calibri" w:cs="Calibri"/>
                 <w:b/>
                 <w:sz w:val="16"/>
               </w:rPr>
-            </w:pPr>
-            <w:proofErr w:type="spellStart"/>
-            <w:r>
-              <w:rPr>
-                <w:rFonts w:ascii="Calibri" w:hAnsi="Calibri" w:cs="Calibri"/>
-                <w:b/>
-                <w:sz w:val="16"/>
-              </w:rPr>
-              <w:t>Provisional</w:t>
-            </w:r>
-            <w:proofErr w:type="spellEnd"/>
-            <w:r>
-              <w:rPr>
-                <w:rFonts w:ascii="Calibri" w:hAnsi="Calibri" w:cs="Calibri"/>
-                <w:b/>
-                <w:sz w:val="16"/>
-              </w:rPr>
-              <w:t xml:space="preserve"> </w:t>
-            </w:r>
-            <w:proofErr w:type="spellStart"/>
-            <w:r>
-              <w:rPr>
-                <w:rFonts w:ascii="Calibri" w:hAnsi="Calibri" w:cs="Calibri"/>
-                <w:b/>
-                <w:sz w:val="16"/>
-              </w:rPr>
-              <w:t>result</w:t>
-            </w:r>
-            <w:proofErr w:type="spellEnd"/>
-          </w:p>
-        </w:tc>
-        <w:tc>
-          <w:tcPr>
-            <w:tcW w:w="1161" w:type="pct"/>
-          </w:tcPr>
-          <w:p>
-            <w:pPr>
-              <w:rPr>
-                <w:rFonts w:ascii="Calibri" w:hAnsi="Calibri" w:cs="Calibri"/>
-                <w:b/>
-                <w:sz w:val="16"/>
-              </w:rPr>
-            </w:pPr>
-            <w:proofErr w:type="spellStart"/>
-            <w:proofErr w:type="gramStart"/>
-            <w:r>
-              <w:rPr>
-                <w:rFonts w:ascii="Calibri" w:hAnsi="Calibri" w:cs="Calibri"/>
-                <w:b/>
-                <w:sz w:val="16"/>
-              </w:rPr>
-              <w:t>Notes</w:t>
-            </w:r>
-            <w:proofErr w:type="spellEnd"/>
-            <w:r>
-              <w:rPr>
-                <w:rFonts w:ascii="Calibri" w:hAnsi="Calibri" w:cs="Calibri"/>
-                <w:b/>
-                <w:sz w:val="16"/>
-              </w:rPr>
-              <w:t xml:space="preserve"> /</w:t>
-            </w:r>
-            <w:proofErr w:type="gramEnd"/>
-            <w:r>
-              <w:rPr>
-                <w:rFonts w:ascii="Calibri" w:hAnsi="Calibri" w:cs="Calibri"/>
-                <w:b/>
-                <w:sz w:val="16"/>
-              </w:rPr>
-              <w:t xml:space="preserve"> </w:t>
-            </w:r>
-            <w:proofErr w:type="spellStart"/>
-            <w:r>
-              <w:rPr>
-                <w:rFonts w:ascii="Calibri" w:hAnsi="Calibri" w:cs="Calibri"/>
-                <w:b/>
-                <w:sz w:val="16"/>
-              </w:rPr>
-              <w:t>final</w:t>
-            </w:r>
-            <w:proofErr w:type="spellEnd"/>
-            <w:r>
-              <w:rPr>
-                <w:rFonts w:ascii="Calibri" w:hAnsi="Calibri" w:cs="Calibri"/>
-                <w:b/>
-                <w:sz w:val="16"/>
-              </w:rPr>
-              <w:t xml:space="preserve"> </w:t>
-            </w:r>
-            <w:proofErr w:type="spellStart"/>
-            <w:r>
-              <w:rPr>
-                <w:rFonts w:ascii="Calibri" w:hAnsi="Calibri" w:cs="Calibri"/>
-                <w:b/>
-                <w:sz w:val="16"/>
-              </w:rPr>
-              <w:t>result</w:t>
-            </w:r>
-            <w:proofErr w:type="spellEnd"/>
+              <w:t>Notes / final result</w:t>
+            </w:r>
           </w:p>
         </w:tc>
       </w:tr>
@@ -834,18 +708,8 @@
                 <w:sz w:val="16"/>
                 <w:lang w:val="en-US"/>
               </w:rPr>
-              <w:t xml:space="preserve"> changes to cite journal and adds </w:t>
-            </w:r>
-            <w:proofErr w:type="spellStart"/>
-            <w:r>
-              <w:rPr>
-                <w:rFonts w:ascii="Calibri" w:hAnsi="Calibri" w:cs="Calibri"/>
-                <w:sz w:val="16"/>
-                <w:lang w:val="en-US"/>
-              </w:rPr>
-              <w:t>doi</w:t>
-            </w:r>
-            <w:proofErr w:type="spellEnd"/>
+              <w:t xml:space="preserve"> changes to cite journal and adds doi</w:t>
+            </w:r>
           </w:p>
         </w:tc>
       </w:tr>
@@ -933,24 +797,7 @@
                 <w:sz w:val="16"/>
                 <w:lang w:val="en-US"/>
               </w:rPr>
-              <w:t>Central Bureau Electronic Telegrams</w:t>
-            </w:r>
-            <w:r>
-              <w:rPr>
-                <w:rFonts w:ascii="Calibri" w:hAnsi="Calibri" w:cs="Calibri"/>
-                <w:sz w:val="16"/>
-                <w:lang w:val="en-US"/>
-              </w:rPr>
-              <w:t xml:space="preserve"> </w:t>
-            </w:r>
-            <w:proofErr w:type="gramStart"/>
-            <w:r>
-              <w:rPr>
-                <w:rFonts w:ascii="Calibri" w:hAnsi="Calibri" w:cs="Calibri"/>
-                <w:sz w:val="16"/>
-                <w:lang w:val="en-US"/>
-              </w:rPr>
-              <w:t>f</w:t>
+              <w:t>Central Bureau Electronic Telegrams f</w:t>
             </w:r>
             <w:r>
               <w:rPr>
@@ -966,16 +813,7 @@
                 <w:sz w:val="16"/>
                 <w:lang w:val="en-US"/>
               </w:rPr>
-              <w:t>IAU</w:t>
-            </w:r>
-            <w:proofErr w:type="gramEnd"/>
-            <w:r>
-              <w:rPr>
-                <w:rFonts w:ascii="Calibri" w:hAnsi="Calibri" w:cs="Calibri"/>
-                <w:sz w:val="16"/>
-                <w:lang w:val="en-US"/>
-              </w:rPr>
-              <w:t xml:space="preserve"> Circular</w:t>
+              <w:t>IAU Circular</w:t>
             </w:r>
             <w:r>
               <w:rPr>
@@ -1089,49 +927,21 @@
               </w:rPr>
               <w:t xml:space="preserve">changes to </w:t>
             </w:r>
-            <w:proofErr w:type="spellStart"/>
-            <w:r>
-              <w:rPr>
-                <w:rFonts w:ascii="Calibri" w:hAnsi="Calibri" w:cs="Calibri"/>
-                <w:sz w:val="16"/>
-                <w:lang w:val="en-US"/>
-              </w:rPr>
-              <w:t>citebook</w:t>
-            </w:r>
-            <w:proofErr w:type="spellEnd"/>
-            <w:r>
-              <w:rPr>
-                <w:rFonts w:ascii="Calibri" w:hAnsi="Calibri" w:cs="Calibri"/>
-                <w:sz w:val="16"/>
-                <w:lang w:val="en-US"/>
-              </w:rPr>
-              <w:t xml:space="preserve"> but </w:t>
-            </w:r>
-            <w:proofErr w:type="gramStart"/>
-            <w:r>
-              <w:rPr>
-                <w:rFonts w:ascii="Calibri" w:hAnsi="Calibri" w:cs="Calibri"/>
-                <w:sz w:val="16"/>
-                <w:lang w:val="en-US"/>
-              </w:rPr>
-              <w:t xml:space="preserve">causes </w:t>
-            </w:r>
-            <w:r>
-              <w:rPr>
-                <w:rFonts w:ascii="Calibri" w:hAnsi="Calibri" w:cs="Calibri"/>
-                <w:sz w:val="16"/>
-                <w:lang w:val="en-US"/>
-              </w:rPr>
-              <w:t> {</w:t>
-            </w:r>
-            <w:proofErr w:type="gramEnd"/>
-            <w:r>
-              <w:rPr>
-                <w:rFonts w:ascii="Calibri" w:hAnsi="Calibri" w:cs="Calibri"/>
-                <w:sz w:val="16"/>
-                <w:lang w:val="en-US"/>
-              </w:rPr>
-              <w:t>{</w:t>
+            <w:r>
+              <w:rPr>
+                <w:rFonts w:ascii="Calibri" w:hAnsi="Calibri" w:cs="Calibri"/>
+                <w:sz w:val="16"/>
+                <w:lang w:val="en-US"/>
+              </w:rPr>
+              <w:t xml:space="preserve">citebook but causes </w:t>
+            </w:r>
+            <w:r>
+              <w:rPr>
+                <w:rFonts w:ascii="Calibri" w:hAnsi="Calibri" w:cs="Calibri"/>
+                <w:sz w:val="16"/>
+                <w:lang w:val="en-US"/>
+              </w:rPr>
+              <w:t> {{</w:t>
             </w:r>
             <w:hyperlink r:id="rId5" w:tooltip="Template:Cite book" w:history="1">
               <w:r>
@@ -1247,25 +1057,7 @@
                 <w:sz w:val="16"/>
                 <w:lang w:val="en-US"/>
               </w:rPr>
-              <w:t xml:space="preserve">Gadget: </w:t>
-            </w:r>
-            <w:proofErr w:type="spellStart"/>
-            <w:r>
-              <w:rPr>
-                <w:rFonts w:ascii="Calibri" w:hAnsi="Calibri" w:cs="Calibri"/>
-                <w:sz w:val="16"/>
-                <w:lang w:val="en-US"/>
-              </w:rPr>
-              <w:t>unrleated</w:t>
-            </w:r>
-            <w:proofErr w:type="spellEnd"/>
-            <w:r>
-              <w:rPr>
-                <w:rFonts w:ascii="Calibri" w:hAnsi="Calibri" w:cs="Calibri"/>
-                <w:sz w:val="16"/>
-                <w:lang w:val="en-US"/>
-              </w:rPr>
-              <w:t xml:space="preserve"> HDL added </w:t>
+              <w:t xml:space="preserve">Gadget: unrleated HDL added </w:t>
             </w:r>
             <w:r>
               <w:rPr>
@@ -1290,197 +1082,40 @@
               </w:rPr>
               <w:t xml:space="preserve">HDL is for </w:t>
             </w:r>
-            <w:proofErr w:type="spellStart"/>
-            <w:r>
-              <w:rPr>
-                <w:rFonts w:ascii="Calibri" w:hAnsi="Calibri" w:cs="Calibri"/>
-                <w:sz w:val="16"/>
-                <w:lang w:val="en-US"/>
-              </w:rPr>
-              <w:t>Publicación</w:t>
-            </w:r>
-            <w:proofErr w:type="spellEnd"/>
-            <w:r>
-              <w:rPr>
-                <w:rFonts w:ascii="Calibri" w:hAnsi="Calibri" w:cs="Calibri"/>
-                <w:sz w:val="16"/>
-                <w:lang w:val="en-US"/>
-              </w:rPr>
-              <w:t xml:space="preserve">: </w:t>
-            </w:r>
-          </w:p>
-          <w:p>
-            <w:pPr>
-              <w:rPr>
-                <w:rFonts w:ascii="Calibri" w:hAnsi="Calibri" w:cs="Calibri"/>
-                <w:sz w:val="16"/>
-                <w:lang w:val="en-US"/>
-              </w:rPr>
-            </w:pPr>
-            <w:proofErr w:type="spellStart"/>
-            <w:r>
-              <w:rPr>
-                <w:rFonts w:ascii="Calibri" w:hAnsi="Calibri" w:cs="Calibri"/>
-                <w:sz w:val="16"/>
-                <w:lang w:val="en-US"/>
-              </w:rPr>
-              <w:t>Prevalencia</w:t>
-            </w:r>
-            <w:proofErr w:type="spellEnd"/>
-            <w:r>
-              <w:rPr>
-                <w:rFonts w:ascii="Calibri" w:hAnsi="Calibri" w:cs="Calibri"/>
-                <w:sz w:val="16"/>
-                <w:lang w:val="en-US"/>
-              </w:rPr>
-              <w:t xml:space="preserve"> de </w:t>
-            </w:r>
-            <w:proofErr w:type="spellStart"/>
-            <w:r>
-              <w:rPr>
-                <w:rFonts w:ascii="Calibri" w:hAnsi="Calibri" w:cs="Calibri"/>
-                <w:sz w:val="16"/>
-                <w:lang w:val="en-US"/>
-              </w:rPr>
-              <w:t>síntomas</w:t>
-            </w:r>
-            <w:proofErr w:type="spellEnd"/>
-            <w:r>
-              <w:rPr>
-                <w:rFonts w:ascii="Calibri" w:hAnsi="Calibri" w:cs="Calibri"/>
-                <w:sz w:val="16"/>
-                <w:lang w:val="en-US"/>
-              </w:rPr>
-              <w:t xml:space="preserve"> </w:t>
-            </w:r>
-            <w:proofErr w:type="spellStart"/>
-            <w:r>
-              <w:rPr>
-                <w:rFonts w:ascii="Calibri" w:hAnsi="Calibri" w:cs="Calibri"/>
-                <w:sz w:val="16"/>
-                <w:lang w:val="en-US"/>
-              </w:rPr>
-              <w:t>depresivos</w:t>
-            </w:r>
-            <w:proofErr w:type="spellEnd"/>
-            <w:r>
-              <w:rPr>
-                <w:rFonts w:ascii="Calibri" w:hAnsi="Calibri" w:cs="Calibri"/>
-                <w:sz w:val="16"/>
-                <w:lang w:val="en-US"/>
-              </w:rPr>
-              <w:t xml:space="preserve"> </w:t>
-            </w:r>
-            <w:proofErr w:type="spellStart"/>
-            <w:r>
-              <w:rPr>
-                <w:rFonts w:ascii="Calibri" w:hAnsi="Calibri" w:cs="Calibri"/>
-                <w:sz w:val="16"/>
-                <w:lang w:val="en-US"/>
-              </w:rPr>
-              <w:t>en</w:t>
-            </w:r>
-            <w:proofErr w:type="spellEnd"/>
-            <w:r>
-              <w:rPr>
-                <w:rFonts w:ascii="Calibri" w:hAnsi="Calibri" w:cs="Calibri"/>
-                <w:sz w:val="16"/>
-                <w:lang w:val="en-US"/>
-              </w:rPr>
-              <w:t xml:space="preserve"> dos </w:t>
-            </w:r>
-            <w:proofErr w:type="spellStart"/>
-            <w:r>
-              <w:rPr>
-                <w:rFonts w:ascii="Calibri" w:hAnsi="Calibri" w:cs="Calibri"/>
-                <w:sz w:val="16"/>
-                <w:lang w:val="en-US"/>
-              </w:rPr>
-              <w:t>poblaciones</w:t>
-            </w:r>
-            <w:proofErr w:type="spellEnd"/>
-            <w:r>
-              <w:rPr>
-                <w:rFonts w:ascii="Calibri" w:hAnsi="Calibri" w:cs="Calibri"/>
-                <w:sz w:val="16"/>
-                <w:lang w:val="en-US"/>
-              </w:rPr>
-              <w:t xml:space="preserve"> del </w:t>
-            </w:r>
-            <w:proofErr w:type="spellStart"/>
-            <w:r>
-              <w:rPr>
-                <w:rFonts w:ascii="Calibri" w:hAnsi="Calibri" w:cs="Calibri"/>
-                <w:sz w:val="16"/>
-                <w:lang w:val="en-US"/>
-              </w:rPr>
-              <w:t>departamento</w:t>
-            </w:r>
-            <w:proofErr w:type="spellEnd"/>
-            <w:r>
-              <w:rPr>
-                <w:rFonts w:ascii="Calibri" w:hAnsi="Calibri" w:cs="Calibri"/>
-                <w:sz w:val="16"/>
-                <w:lang w:val="en-US"/>
-              </w:rPr>
-              <w:t xml:space="preserve"> de Caldas posterior al </w:t>
-            </w:r>
-            <w:proofErr w:type="spellStart"/>
-            <w:r>
-              <w:rPr>
-                <w:rFonts w:ascii="Calibri" w:hAnsi="Calibri" w:cs="Calibri"/>
-                <w:sz w:val="16"/>
-                <w:lang w:val="en-US"/>
-              </w:rPr>
-              <w:t>acuerdo</w:t>
-            </w:r>
-            <w:proofErr w:type="spellEnd"/>
-            <w:r>
-              <w:rPr>
-                <w:rFonts w:ascii="Calibri" w:hAnsi="Calibri" w:cs="Calibri"/>
-                <w:sz w:val="16"/>
-                <w:lang w:val="en-US"/>
-              </w:rPr>
-              <w:t xml:space="preserve"> de </w:t>
-            </w:r>
-            <w:proofErr w:type="spellStart"/>
-            <w:proofErr w:type="gramStart"/>
-            <w:r>
-              <w:rPr>
-                <w:rFonts w:ascii="Calibri" w:hAnsi="Calibri" w:cs="Calibri"/>
-                <w:sz w:val="16"/>
-                <w:lang w:val="en-US"/>
-              </w:rPr>
-              <w:t>paz</w:t>
-            </w:r>
-            <w:proofErr w:type="spellEnd"/>
-            <w:r>
-              <w:rPr>
-                <w:rFonts w:ascii="Calibri" w:hAnsi="Calibri" w:cs="Calibri"/>
-                <w:sz w:val="16"/>
-                <w:lang w:val="en-US"/>
-              </w:rPr>
-              <w:t xml:space="preserve"> ,</w:t>
-            </w:r>
-            <w:proofErr w:type="gramEnd"/>
-            <w:r>
-              <w:rPr>
-                <w:rFonts w:ascii="Calibri" w:hAnsi="Calibri" w:cs="Calibri"/>
-                <w:sz w:val="16"/>
-                <w:lang w:val="en-US"/>
-              </w:rPr>
-              <w:t xml:space="preserve"> 2020</w:t>
-            </w:r>
-          </w:p>
-          <w:p>
-            <w:pPr>
-              <w:rPr>
-                <w:rFonts w:ascii="Calibri" w:hAnsi="Calibri" w:cs="Calibri"/>
-                <w:sz w:val="16"/>
-                <w:lang w:val="en-US"/>
-              </w:rPr>
-            </w:pPr>
-            <w:proofErr w:type="gramStart"/>
+            <w:r>
+              <w:rPr>
+                <w:rFonts w:ascii="Calibri" w:hAnsi="Calibri" w:cs="Calibri"/>
+                <w:sz w:val="16"/>
+                <w:lang w:val="en-US"/>
+              </w:rPr>
+              <w:t xml:space="preserve">Publicación: </w:t>
+            </w:r>
+          </w:p>
+          <w:p>
+            <w:pPr>
+              <w:rPr>
+                <w:rFonts w:ascii="Calibri" w:hAnsi="Calibri" w:cs="Calibri"/>
+                <w:sz w:val="16"/>
+                <w:lang w:val="en-US"/>
+              </w:rPr>
+            </w:pPr>
+            <w:r>
+              <w:rPr>
+                <w:rFonts w:ascii="Calibri" w:hAnsi="Calibri" w:cs="Calibri"/>
+                <w:sz w:val="16"/>
+                <w:lang w:val="en-US"/>
+              </w:rPr>
+              <w:t>Prevalencia de síntomas depresivos en dos poblaciones del departamento de Caldas posterior al acuerdo de paz , 2020</w:t>
+            </w:r>
+          </w:p>
+          <w:p>
+            <w:pPr>
+              <w:rPr>
+                <w:rFonts w:ascii="Calibri" w:hAnsi="Calibri" w:cs="Calibri"/>
+                <w:sz w:val="16"/>
+                <w:lang w:val="en-US"/>
+              </w:rPr>
+            </w:pPr>
             <w:r>
               <w:rPr>
                 <w:rFonts w:ascii="Calibri" w:hAnsi="Calibri" w:cs="Calibri"/>
@@ -1489,7 +1124,6 @@
               </w:rPr>
               <w:t>Not</w:t>
             </w:r>
-            <w:proofErr w:type="gramEnd"/>
             <w:r>
               <w:rPr>
                 <w:rFonts w:ascii="Calibri" w:hAnsi="Calibri" w:cs="Calibri"/>
@@ -1546,18 +1180,8 @@
                 <w:sz w:val="16"/>
                 <w:lang w:val="en-US"/>
               </w:rPr>
-              <w:t xml:space="preserve">Further investigation </w:t>
-            </w:r>
-            <w:proofErr w:type="spellStart"/>
-            <w:r>
-              <w:rPr>
-                <w:rFonts w:ascii="Calibri" w:hAnsi="Calibri" w:cs="Calibri"/>
-                <w:sz w:val="16"/>
-                <w:lang w:val="en-US"/>
-              </w:rPr>
-              <w:t>requirerd</w:t>
-            </w:r>
-            <w:proofErr w:type="spellEnd"/>
+              <w:t>Further investigation requirerd</w:t>
+            </w:r>
           </w:p>
           <w:p>
             <w:pPr>
@@ -1749,69 +1373,15 @@
                 <w:sz w:val="16"/>
                 <w:lang w:val="en-US"/>
               </w:rPr>
-              <w:t xml:space="preserve">Still reproduces, </w:t>
-            </w:r>
-            <w:proofErr w:type="spellStart"/>
-            <w:r>
-              <w:rPr>
-                <w:rFonts w:ascii="Calibri" w:hAnsi="Calibri" w:cs="Calibri"/>
-                <w:sz w:val="16"/>
-                <w:lang w:val="en-US"/>
-              </w:rPr>
-              <w:t>invetstigation</w:t>
-            </w:r>
-            <w:proofErr w:type="spellEnd"/>
-            <w:r>
-              <w:rPr>
-                <w:rFonts w:ascii="Calibri" w:hAnsi="Calibri" w:cs="Calibri"/>
-                <w:sz w:val="16"/>
-                <w:lang w:val="en-US"/>
-              </w:rPr>
-              <w:t xml:space="preserve"> </w:t>
-            </w:r>
-            <w:proofErr w:type="spellStart"/>
-            <w:r>
-              <w:rPr>
-                <w:rFonts w:ascii="Calibri" w:hAnsi="Calibri" w:cs="Calibri"/>
-                <w:sz w:val="16"/>
-                <w:lang w:val="en-US"/>
-              </w:rPr>
-              <w:t>requirerd</w:t>
-            </w:r>
-            <w:proofErr w:type="spellEnd"/>
-            <w:r>
-              <w:rPr>
-                <w:rFonts w:ascii="Calibri" w:hAnsi="Calibri" w:cs="Calibri"/>
-                <w:sz w:val="16"/>
-                <w:lang w:val="en-US"/>
-              </w:rPr>
-              <w:t xml:space="preserve"> i</w:t>
-            </w:r>
-            <w:r>
-              <w:rPr>
-                <w:rFonts w:ascii="Calibri" w:hAnsi="Calibri" w:cs="Calibri"/>
-                <w:sz w:val="16"/>
-                <w:lang w:val="en-US"/>
-              </w:rPr>
-              <w:t xml:space="preserve">f </w:t>
-            </w:r>
-            <w:proofErr w:type="spellStart"/>
-            <w:r>
-              <w:rPr>
-                <w:rFonts w:ascii="Calibri" w:hAnsi="Calibri" w:cs="Calibri"/>
-                <w:sz w:val="16"/>
-                <w:lang w:val="en-US"/>
-              </w:rPr>
-              <w:t>behaviour</w:t>
-            </w:r>
-            <w:proofErr w:type="spellEnd"/>
-            <w:r>
-              <w:rPr>
-                <w:rFonts w:ascii="Calibri" w:hAnsi="Calibri" w:cs="Calibri"/>
-                <w:sz w:val="16"/>
-                <w:lang w:val="en-US"/>
-              </w:rPr>
-              <w:t xml:space="preserve"> is correct or not</w:t>
+              <w:t>Still reproduces, invetstigation requirerd i</w:t>
+            </w:r>
+            <w:r>
+              <w:rPr>
+                <w:rFonts w:ascii="Calibri" w:hAnsi="Calibri" w:cs="Calibri"/>
+                <w:sz w:val="16"/>
+                <w:lang w:val="en-US"/>
+              </w:rPr>
+              <w:t>f behaviour is correct or not</w:t>
             </w:r>
           </w:p>
         </w:tc>
@@ -1899,69 +1469,15 @@
                 <w:sz w:val="16"/>
                 <w:lang w:val="en-US"/>
               </w:rPr>
-              <w:t xml:space="preserve">Still reproduces, </w:t>
-            </w:r>
-            <w:proofErr w:type="spellStart"/>
-            <w:r>
-              <w:rPr>
-                <w:rFonts w:ascii="Calibri" w:hAnsi="Calibri" w:cs="Calibri"/>
-                <w:sz w:val="16"/>
-                <w:lang w:val="en-US"/>
-              </w:rPr>
-              <w:t>invetstigation</w:t>
-            </w:r>
-            <w:proofErr w:type="spellEnd"/>
-            <w:r>
-              <w:rPr>
-                <w:rFonts w:ascii="Calibri" w:hAnsi="Calibri" w:cs="Calibri"/>
-                <w:sz w:val="16"/>
-                <w:lang w:val="en-US"/>
-              </w:rPr>
-              <w:t xml:space="preserve"> </w:t>
-            </w:r>
-            <w:proofErr w:type="spellStart"/>
-            <w:r>
-              <w:rPr>
-                <w:rFonts w:ascii="Calibri" w:hAnsi="Calibri" w:cs="Calibri"/>
-                <w:sz w:val="16"/>
-                <w:lang w:val="en-US"/>
-              </w:rPr>
-              <w:t>requirerd</w:t>
-            </w:r>
-            <w:proofErr w:type="spellEnd"/>
-            <w:r>
-              <w:rPr>
-                <w:rFonts w:ascii="Calibri" w:hAnsi="Calibri" w:cs="Calibri"/>
-                <w:sz w:val="16"/>
-                <w:lang w:val="en-US"/>
-              </w:rPr>
-              <w:t xml:space="preserve"> i</w:t>
-            </w:r>
-            <w:r>
-              <w:rPr>
-                <w:rFonts w:ascii="Calibri" w:hAnsi="Calibri" w:cs="Calibri"/>
-                <w:sz w:val="16"/>
-                <w:lang w:val="en-US"/>
-              </w:rPr>
-              <w:t xml:space="preserve">f </w:t>
-            </w:r>
-            <w:proofErr w:type="spellStart"/>
-            <w:r>
-              <w:rPr>
-                <w:rFonts w:ascii="Calibri" w:hAnsi="Calibri" w:cs="Calibri"/>
-                <w:sz w:val="16"/>
-                <w:lang w:val="en-US"/>
-              </w:rPr>
-              <w:t>behaviour</w:t>
-            </w:r>
-            <w:proofErr w:type="spellEnd"/>
-            <w:r>
-              <w:rPr>
-                <w:rFonts w:ascii="Calibri" w:hAnsi="Calibri" w:cs="Calibri"/>
-                <w:sz w:val="16"/>
-                <w:lang w:val="en-US"/>
-              </w:rPr>
-              <w:t xml:space="preserve"> is correct or not</w:t>
+              <w:t>Still reproduces, invetstigation requirerd i</w:t>
+            </w:r>
+            <w:r>
+              <w:rPr>
+                <w:rFonts w:ascii="Calibri" w:hAnsi="Calibri" w:cs="Calibri"/>
+                <w:sz w:val="16"/>
+                <w:lang w:val="en-US"/>
+              </w:rPr>
+              <w:t>f behaviour is correct or not</w:t>
             </w:r>
           </w:p>
         </w:tc>
@@ -2049,33 +1565,7 @@
                 <w:sz w:val="16"/>
                 <w:lang w:val="en-US"/>
               </w:rPr>
-              <w:t xml:space="preserve">Half fixed, </w:t>
-            </w:r>
-            <w:r>
-              <w:rPr>
-                <w:rFonts w:ascii="Calibri" w:hAnsi="Calibri" w:cs="Calibri"/>
-                <w:sz w:val="16"/>
-                <w:lang w:val="en-US"/>
-              </w:rPr>
-              <w:t>&lt;ref name=Evans_et_al_2000</w:t>
-            </w:r>
-            <w:proofErr w:type="gramStart"/>
-            <w:r>
-              <w:rPr>
-                <w:rFonts w:ascii="Calibri" w:hAnsi="Calibri" w:cs="Calibri"/>
-                <w:sz w:val="16"/>
-                <w:lang w:val="en-US"/>
-              </w:rPr>
-              <w:t>&gt;{</w:t>
-            </w:r>
-            <w:proofErr w:type="gramEnd"/>
-            <w:r>
-              <w:rPr>
-                <w:rFonts w:ascii="Calibri" w:hAnsi="Calibri" w:cs="Calibri"/>
-                <w:sz w:val="16"/>
-                <w:lang w:val="en-US"/>
-              </w:rPr>
-              <w:t>{cite journal</w:t>
+              <w:t>Half fixed, &lt;ref name=Evans_et_al_2000&gt;{{cite journal</w:t>
             </w:r>
           </w:p>
           <w:p>
@@ -2144,78 +1634,24 @@
                 <w:lang w:val="en-US"/>
               </w:rPr>
               <w:lastRenderedPageBreak/>
-              <w:t xml:space="preserve"> | last5=</w:t>
-            </w:r>
-            <w:proofErr w:type="spellStart"/>
-            <w:r>
-              <w:rPr>
-                <w:rFonts w:ascii="Calibri" w:hAnsi="Calibri" w:cs="Calibri"/>
-                <w:sz w:val="16"/>
-                <w:lang w:val="en-US"/>
-              </w:rPr>
-              <w:t>Langersek</w:t>
-            </w:r>
-            <w:proofErr w:type="spellEnd"/>
-            <w:r>
-              <w:rPr>
-                <w:rFonts w:ascii="Calibri" w:hAnsi="Calibri" w:cs="Calibri"/>
-                <w:sz w:val="16"/>
-                <w:lang w:val="en-US"/>
-              </w:rPr>
-              <w:t xml:space="preserve"> | first5=R. | last6=</w:t>
-            </w:r>
-            <w:proofErr w:type="spellStart"/>
-            <w:r>
-              <w:rPr>
-                <w:rFonts w:ascii="Calibri" w:hAnsi="Calibri" w:cs="Calibri"/>
-                <w:sz w:val="16"/>
-                <w:lang w:val="en-US"/>
-              </w:rPr>
-              <w:t>Suntzeff</w:t>
-            </w:r>
-            <w:proofErr w:type="spellEnd"/>
-            <w:r>
-              <w:rPr>
-                <w:rFonts w:ascii="Calibri" w:hAnsi="Calibri" w:cs="Calibri"/>
-                <w:sz w:val="16"/>
-                <w:lang w:val="en-US"/>
-              </w:rPr>
-              <w:t xml:space="preserve"> | first6=N.</w:t>
-            </w:r>
-          </w:p>
-          <w:p>
-            <w:pPr>
-              <w:rPr>
-                <w:rFonts w:ascii="Calibri" w:hAnsi="Calibri" w:cs="Calibri"/>
-                <w:sz w:val="16"/>
-                <w:lang w:val="en-US"/>
-              </w:rPr>
-            </w:pPr>
-            <w:r>
-              <w:rPr>
-                <w:rFonts w:ascii="Calibri" w:hAnsi="Calibri" w:cs="Calibri"/>
-                <w:sz w:val="16"/>
-                <w:lang w:val="en-US"/>
-              </w:rPr>
-              <w:t xml:space="preserve"> | last7=</w:t>
-            </w:r>
-            <w:proofErr w:type="spellStart"/>
-            <w:r>
-              <w:rPr>
-                <w:rFonts w:ascii="Calibri" w:hAnsi="Calibri" w:cs="Calibri"/>
-                <w:sz w:val="16"/>
-                <w:lang w:val="en-US"/>
-              </w:rPr>
-              <w:t>Strolger</w:t>
-            </w:r>
-            <w:proofErr w:type="spellEnd"/>
-            <w:r>
-              <w:rPr>
-                <w:rFonts w:ascii="Calibri" w:hAnsi="Calibri" w:cs="Calibri"/>
-                <w:sz w:val="16"/>
-                <w:lang w:val="en-US"/>
-              </w:rPr>
-              <w:t xml:space="preserve"> | first7=L. | last8=Marples | first8=P.</w:t>
+              <w:t xml:space="preserve"> | last5=Langersek | first5=R. | last6=Suntzeff | first6=N.</w:t>
+            </w:r>
+          </w:p>
+          <w:p>
+            <w:pPr>
+              <w:rPr>
+                <w:rFonts w:ascii="Calibri" w:hAnsi="Calibri" w:cs="Calibri"/>
+                <w:sz w:val="16"/>
+                <w:lang w:val="en-US"/>
+              </w:rPr>
+            </w:pPr>
+            <w:r>
+              <w:rPr>
+                <w:rFonts w:ascii="Calibri" w:hAnsi="Calibri" w:cs="Calibri"/>
+                <w:sz w:val="16"/>
+                <w:lang w:val="en-US"/>
+              </w:rPr>
+              <w:t xml:space="preserve"> | last7=Strolger | first7=L. | last8=Marples | first8=P.</w:t>
             </w:r>
           </w:p>
           <w:p>
@@ -2283,33 +1719,7 @@
                 <w:sz w:val="16"/>
                 <w:lang w:val="en-US"/>
               </w:rPr>
-              <w:t xml:space="preserve"> | bibcode=2000IAUC.7425....1</w:t>
-            </w:r>
-            <w:proofErr w:type="gramStart"/>
-            <w:r>
-              <w:rPr>
-                <w:rFonts w:ascii="Calibri" w:hAnsi="Calibri" w:cs="Calibri"/>
-                <w:sz w:val="16"/>
-                <w:lang w:val="en-US"/>
-              </w:rPr>
-              <w:t>E }}&lt;</w:t>
-            </w:r>
-            <w:proofErr w:type="gramEnd"/>
-            <w:r>
-              <w:rPr>
-                <w:rFonts w:ascii="Calibri" w:hAnsi="Calibri" w:cs="Calibri"/>
-                <w:sz w:val="16"/>
-                <w:lang w:val="en-US"/>
-              </w:rPr>
-              <w:t>/ref&gt;</w:t>
-            </w:r>
-            <w:r>
-              <w:rPr>
-                <w:rFonts w:ascii="Calibri" w:hAnsi="Calibri" w:cs="Calibri"/>
-                <w:sz w:val="16"/>
-                <w:lang w:val="en-US"/>
-              </w:rPr>
-              <w:t xml:space="preserve"> g</w:t>
+              <w:t xml:space="preserve"> | bibcode=2000IAUC.7425....1E }}&lt;/ref&gt; g</w:t>
             </w:r>
             <w:r>
               <w:rPr>
@@ -2341,25 +1751,7 @@
                 <w:sz w:val="16"/>
                 <w:lang w:val="en-US"/>
               </w:rPr>
-              <w:t>&lt;ref name=Suntzeff_Kundu_2000</w:t>
-            </w:r>
-            <w:proofErr w:type="gramStart"/>
-            <w:r>
-              <w:rPr>
-                <w:rFonts w:ascii="Calibri" w:hAnsi="Calibri" w:cs="Calibri"/>
-                <w:sz w:val="16"/>
-                <w:lang w:val="en-US"/>
-              </w:rPr>
-              <w:t>&gt;{</w:t>
-            </w:r>
-            <w:proofErr w:type="gramEnd"/>
-            <w:r>
-              <w:rPr>
-                <w:rFonts w:ascii="Calibri" w:hAnsi="Calibri" w:cs="Calibri"/>
-                <w:sz w:val="16"/>
-                <w:lang w:val="en-US"/>
-              </w:rPr>
-              <w:t>{cite journal</w:t>
+              <w:t>&lt;ref name=Suntzeff_Kundu_2000&gt;{{cite journal</w:t>
             </w:r>
           </w:p>
           <w:p>
@@ -2393,25 +1785,7 @@
                 <w:sz w:val="16"/>
                 <w:lang w:val="en-US"/>
               </w:rPr>
-              <w:t xml:space="preserve"> | last1=</w:t>
-            </w:r>
-            <w:proofErr w:type="spellStart"/>
-            <w:r>
-              <w:rPr>
-                <w:rFonts w:ascii="Calibri" w:hAnsi="Calibri" w:cs="Calibri"/>
-                <w:sz w:val="16"/>
-                <w:lang w:val="en-US"/>
-              </w:rPr>
-              <w:t>Suntzeff</w:t>
-            </w:r>
-            <w:proofErr w:type="spellEnd"/>
-            <w:r>
-              <w:rPr>
-                <w:rFonts w:ascii="Calibri" w:hAnsi="Calibri" w:cs="Calibri"/>
-                <w:sz w:val="16"/>
-                <w:lang w:val="en-US"/>
-              </w:rPr>
-              <w:t xml:space="preserve"> | first1=N. | last2=Kundu | first2=A.</w:t>
+              <w:t xml:space="preserve"> | last1=Suntzeff | first1=N. | last2=Kundu | first2=A.</w:t>
             </w:r>
           </w:p>
           <w:p>
@@ -2479,25 +1853,7 @@
                 <w:sz w:val="16"/>
                 <w:lang w:val="en-US"/>
               </w:rPr>
-              <w:t xml:space="preserve"> | bibcode=2000IAUC.7428....2</w:t>
-            </w:r>
-            <w:proofErr w:type="gramStart"/>
-            <w:r>
-              <w:rPr>
-                <w:rFonts w:ascii="Calibri" w:hAnsi="Calibri" w:cs="Calibri"/>
-                <w:sz w:val="16"/>
-                <w:lang w:val="en-US"/>
-              </w:rPr>
-              <w:t>S }}&lt;</w:t>
-            </w:r>
-            <w:proofErr w:type="gramEnd"/>
-            <w:r>
-              <w:rPr>
-                <w:rFonts w:ascii="Calibri" w:hAnsi="Calibri" w:cs="Calibri"/>
-                <w:sz w:val="16"/>
-                <w:lang w:val="en-US"/>
-              </w:rPr>
-              <w:t>/ref&gt;</w:t>
+              <w:t xml:space="preserve"> | bibcode=2000IAUC.7428....2S }}&lt;/ref&gt;</w:t>
             </w:r>
             <w:r>
               <w:rPr>
@@ -2539,18 +1895,8 @@
                 <w:lang w:val="en-US"/>
               </w:rPr>
               <w:br/>
-              <w:t xml:space="preserve">number / page stays unchanged / incorrect. Deeper investigation </w:t>
-            </w:r>
-            <w:proofErr w:type="spellStart"/>
-            <w:r>
-              <w:rPr>
-                <w:rFonts w:ascii="Calibri" w:hAnsi="Calibri" w:cs="Calibri"/>
-                <w:sz w:val="16"/>
-                <w:lang w:val="en-US"/>
-              </w:rPr>
-              <w:t>requirerd</w:t>
-            </w:r>
-            <w:proofErr w:type="spellEnd"/>
+              <w:t>number / page stays unchanged / incorrect. Deeper investigation requirerd</w:t>
+            </w:r>
           </w:p>
         </w:tc>
       </w:tr>
@@ -2587,39 +1933,12 @@
                 <w:sz w:val="16"/>
               </w:rPr>
             </w:pPr>
-            <w:proofErr w:type="spellStart"/>
-            <w:proofErr w:type="gramStart"/>
-            <w:r>
-              <w:rPr>
-                <w:rFonts w:ascii="Calibri" w:hAnsi="Calibri" w:cs="Calibri"/>
-                <w:sz w:val="16"/>
-              </w:rPr>
-              <w:t>url</w:t>
-            </w:r>
-            <w:proofErr w:type="spellEnd"/>
-            <w:proofErr w:type="gramEnd"/>
-            <w:r>
-              <w:rPr>
-                <w:rFonts w:ascii="Calibri" w:hAnsi="Calibri" w:cs="Calibri"/>
-                <w:sz w:val="16"/>
-              </w:rPr>
-              <w:t xml:space="preserve"> → </w:t>
-            </w:r>
-            <w:proofErr w:type="spellStart"/>
-            <w:r>
-              <w:rPr>
-                <w:rFonts w:ascii="Calibri" w:hAnsi="Calibri" w:cs="Calibri"/>
-                <w:sz w:val="16"/>
-              </w:rPr>
-              <w:t>chapter-url</w:t>
-            </w:r>
-            <w:proofErr w:type="spellEnd"/>
-            <w:r>
-              <w:rPr>
-                <w:rFonts w:ascii="Calibri" w:hAnsi="Calibri" w:cs="Calibri"/>
-                <w:sz w:val="16"/>
-              </w:rPr>
-              <w:t xml:space="preserve"> (https://en.wikipedia.org/wiki/Special:Diff/1309227702)</w:t>
+            <w:r>
+              <w:rPr>
+                <w:rFonts w:ascii="Calibri" w:hAnsi="Calibri" w:cs="Calibri"/>
+                <w:sz w:val="16"/>
+              </w:rPr>
+              <w:t>url → chapter-url (https://en.wikipedia.org/wiki/Special:Diff/1309227702)</w:t>
             </w:r>
           </w:p>
         </w:tc>
@@ -2641,25 +1960,7 @@
                 <w:sz w:val="16"/>
                 <w:lang w:val="en-US"/>
               </w:rPr>
-              <w:t>STILL REPRODUCES: whole-book IA URLs moved to chapter-</w:t>
-            </w:r>
-            <w:proofErr w:type="spellStart"/>
-            <w:r>
-              <w:rPr>
-                <w:rFonts w:ascii="Calibri" w:hAnsi="Calibri" w:cs="Calibri"/>
-                <w:sz w:val="16"/>
-                <w:lang w:val="en-US"/>
-              </w:rPr>
-              <w:t>url</w:t>
-            </w:r>
-            <w:proofErr w:type="spellEnd"/>
-            <w:r>
-              <w:rPr>
-                <w:rFonts w:ascii="Calibri" w:hAnsi="Calibri" w:cs="Calibri"/>
-                <w:sz w:val="16"/>
-                <w:lang w:val="en-US"/>
-              </w:rPr>
-              <w:t>.</w:t>
+              <w:t>STILL REPRODUCES: whole-book IA URLs moved to chapter-url.</w:t>
             </w:r>
           </w:p>
         </w:tc>
@@ -2762,25 +2063,7 @@
                 <w:sz w:val="16"/>
                 <w:lang w:val="en-US"/>
               </w:rPr>
-              <w:t xml:space="preserve">NOT REPRODUCED: </w:t>
-            </w:r>
-            <w:proofErr w:type="spellStart"/>
-            <w:r>
-              <w:rPr>
-                <w:rFonts w:ascii="Calibri" w:hAnsi="Calibri" w:cs="Calibri"/>
-                <w:sz w:val="16"/>
-                <w:lang w:val="en-US"/>
-              </w:rPr>
-              <w:t>Figshare</w:t>
-            </w:r>
-            <w:proofErr w:type="spellEnd"/>
-            <w:r>
-              <w:rPr>
-                <w:rFonts w:ascii="Calibri" w:hAnsi="Calibri" w:cs="Calibri"/>
-                <w:sz w:val="16"/>
-                <w:lang w:val="en-US"/>
-              </w:rPr>
-              <w:t xml:space="preserve"> URL not added.</w:t>
+              <w:t>NOT REPRODUCED: Figshare URL not added.</w:t>
             </w:r>
           </w:p>
         </w:tc>
@@ -2834,33 +2117,7 @@
                 <w:sz w:val="16"/>
                 <w:lang w:val="en-US"/>
               </w:rPr>
-              <w:t xml:space="preserve">DOI is for </w:t>
-            </w:r>
-            <w:r>
-              <w:rPr>
-                <w:rFonts w:ascii="Calibri" w:hAnsi="Calibri" w:cs="Calibri"/>
-                <w:sz w:val="16"/>
-                <w:lang w:val="en-US"/>
-              </w:rPr>
-              <w:t xml:space="preserve">Combinatorics of </w:t>
-            </w:r>
-            <w:proofErr w:type="spellStart"/>
-            <w:r>
-              <w:rPr>
-                <w:rFonts w:ascii="Calibri" w:hAnsi="Calibri" w:cs="Calibri"/>
-                <w:sz w:val="16"/>
-                <w:lang w:val="en-US"/>
-              </w:rPr>
-              <w:t>Coxeter</w:t>
-            </w:r>
-            <w:proofErr w:type="spellEnd"/>
-            <w:r>
-              <w:rPr>
-                <w:rFonts w:ascii="Calibri" w:hAnsi="Calibri" w:cs="Calibri"/>
-                <w:sz w:val="16"/>
-                <w:lang w:val="en-US"/>
-              </w:rPr>
-              <w:t xml:space="preserve"> Groups</w:t>
+              <w:t>DOI is for Combinatorics of Coxeter Groups</w:t>
             </w:r>
             <w:r>
               <w:rPr>
@@ -2893,25 +2150,7 @@
                 <w:sz w:val="16"/>
                 <w:lang w:val="en-US"/>
               </w:rPr>
-              <w:t xml:space="preserve">Anders </w:t>
-            </w:r>
-            <w:proofErr w:type="gramStart"/>
-            <w:r>
-              <w:rPr>
-                <w:rFonts w:ascii="Calibri" w:hAnsi="Calibri" w:cs="Calibri"/>
-                <w:sz w:val="16"/>
-                <w:lang w:val="en-US"/>
-              </w:rPr>
-              <w:t>Bjorner ,</w:t>
-            </w:r>
-            <w:proofErr w:type="gramEnd"/>
-            <w:r>
-              <w:rPr>
-                <w:rFonts w:ascii="Calibri" w:hAnsi="Calibri" w:cs="Calibri"/>
-                <w:sz w:val="16"/>
-                <w:lang w:val="en-US"/>
-              </w:rPr>
-              <w:t xml:space="preserve"> Francesco Brenti</w:t>
+              <w:t>Anders Bjorner , Francesco Brenti</w:t>
             </w:r>
             <w:r>
               <w:rPr>
@@ -2928,68 +2167,15 @@
                 <w:lang w:val="en-US"/>
               </w:rPr>
               <w:br/>
-            </w:r>
-            <w:proofErr w:type="spellStart"/>
-            <w:r>
-              <w:rPr>
-                <w:rFonts w:ascii="Calibri" w:hAnsi="Calibri" w:cs="Calibri"/>
-                <w:sz w:val="16"/>
-                <w:lang w:val="en-US"/>
-              </w:rPr>
-              <w:t>figshare</w:t>
-            </w:r>
-            <w:proofErr w:type="spellEnd"/>
-            <w:r>
-              <w:rPr>
-                <w:rFonts w:ascii="Calibri" w:hAnsi="Calibri" w:cs="Calibri"/>
-                <w:sz w:val="16"/>
-                <w:lang w:val="en-US"/>
-              </w:rPr>
-              <w:t xml:space="preserve"> </w:t>
-            </w:r>
-            <w:proofErr w:type="spellStart"/>
-            <w:r>
-              <w:rPr>
-                <w:rFonts w:ascii="Calibri" w:hAnsi="Calibri" w:cs="Calibri"/>
-                <w:sz w:val="16"/>
-                <w:lang w:val="en-US"/>
-              </w:rPr>
-              <w:t>url</w:t>
-            </w:r>
-            <w:proofErr w:type="spellEnd"/>
-            <w:r>
-              <w:rPr>
-                <w:rFonts w:ascii="Calibri" w:hAnsi="Calibri" w:cs="Calibri"/>
-                <w:sz w:val="16"/>
-                <w:lang w:val="en-US"/>
-              </w:rPr>
-              <w:t xml:space="preserve"> is for </w:t>
-            </w:r>
-            <w:r>
-              <w:rPr>
-                <w:rFonts w:ascii="Calibri" w:hAnsi="Calibri" w:cs="Calibri"/>
-                <w:sz w:val="16"/>
-                <w:lang w:val="en-US"/>
-              </w:rPr>
-              <w:t xml:space="preserve">The Combinatorics of </w:t>
-            </w:r>
-            <w:proofErr w:type="spellStart"/>
-            <w:r>
-              <w:rPr>
-                <w:rFonts w:ascii="Calibri" w:hAnsi="Calibri" w:cs="Calibri"/>
-                <w:sz w:val="16"/>
-                <w:lang w:val="en-US"/>
-              </w:rPr>
-              <w:t>Coxeter</w:t>
-            </w:r>
-            <w:proofErr w:type="spellEnd"/>
-            <w:r>
-              <w:rPr>
-                <w:rFonts w:ascii="Calibri" w:hAnsi="Calibri" w:cs="Calibri"/>
-                <w:sz w:val="16"/>
-                <w:lang w:val="en-US"/>
-              </w:rPr>
-              <w:t xml:space="preserve"> Groups</w:t>
+              <w:t xml:space="preserve">figshare url is for </w:t>
+            </w:r>
+            <w:r>
+              <w:rPr>
+                <w:rFonts w:ascii="Calibri" w:hAnsi="Calibri" w:cs="Calibri"/>
+                <w:sz w:val="16"/>
+                <w:lang w:val="en-US"/>
+              </w:rPr>
+              <w:t>The Combinatorics of Coxeter Groups</w:t>
             </w:r>
           </w:p>
           <w:p>
@@ -3100,25 +2286,7 @@
                 <w:sz w:val="16"/>
                 <w:lang w:val="en-US"/>
               </w:rPr>
-              <w:t xml:space="preserve">INSUFFICIENT EVIDENCE: no ISBN added in </w:t>
-            </w:r>
-            <w:proofErr w:type="gramStart"/>
-            <w:r>
-              <w:rPr>
-                <w:rFonts w:ascii="Calibri" w:hAnsi="Calibri" w:cs="Calibri"/>
-                <w:sz w:val="16"/>
-                <w:lang w:val="en-US"/>
-              </w:rPr>
-              <w:t>replay</w:t>
-            </w:r>
-            <w:proofErr w:type="gramEnd"/>
-            <w:r>
-              <w:rPr>
-                <w:rFonts w:ascii="Calibri" w:hAnsi="Calibri" w:cs="Calibri"/>
-                <w:sz w:val="16"/>
-                <w:lang w:val="en-US"/>
-              </w:rPr>
-              <w:t>, edition not verified.</w:t>
+              <w:t>INSUFFICIENT EVIDENCE: no ISBN added in replay, edition not verified.</w:t>
             </w:r>
           </w:p>
         </w:tc>
@@ -3164,33 +2332,7 @@
                 <w:sz w:val="16"/>
                 <w:lang w:val="en-US"/>
               </w:rPr>
-              <w:t xml:space="preserve"> </w:t>
-            </w:r>
-            <w:proofErr w:type="spellStart"/>
-            <w:r>
-              <w:rPr>
-                <w:rFonts w:ascii="Calibri" w:hAnsi="Calibri" w:cs="Calibri"/>
-                <w:sz w:val="16"/>
-                <w:lang w:val="en-US"/>
-              </w:rPr>
-              <w:t>isbn</w:t>
-            </w:r>
-            <w:proofErr w:type="spellEnd"/>
-            <w:r>
-              <w:rPr>
-                <w:rFonts w:ascii="Calibri" w:hAnsi="Calibri" w:cs="Calibri"/>
-                <w:sz w:val="16"/>
-                <w:lang w:val="en-US"/>
-              </w:rPr>
-              <w:t>=978-0-19-505334-0</w:t>
-            </w:r>
-            <w:r>
-              <w:rPr>
-                <w:rFonts w:ascii="Calibri" w:hAnsi="Calibri" w:cs="Calibri"/>
-                <w:sz w:val="16"/>
-                <w:lang w:val="en-US"/>
-              </w:rPr>
-              <w:t xml:space="preserve"> added</w:t>
+              <w:t xml:space="preserve"> isbn=978-0-19-505334-0 added</w:t>
             </w:r>
           </w:p>
         </w:tc>
@@ -3278,25 +2420,7 @@
                 <w:sz w:val="16"/>
                 <w:lang w:val="en-US"/>
               </w:rPr>
-              <w:t xml:space="preserve">Empty fields are populated correctly, if already present conversion work to series is correct, but title is not changed. Awaiting reply </w:t>
-            </w:r>
-            <w:proofErr w:type="gramStart"/>
-            <w:r>
-              <w:rPr>
-                <w:rFonts w:ascii="Calibri" w:hAnsi="Calibri" w:cs="Calibri"/>
-                <w:sz w:val="16"/>
-                <w:lang w:val="en-US"/>
-              </w:rPr>
-              <w:t>on</w:t>
-            </w:r>
-            <w:proofErr w:type="gramEnd"/>
-            <w:r>
-              <w:rPr>
-                <w:rFonts w:ascii="Calibri" w:hAnsi="Calibri" w:cs="Calibri"/>
-                <w:sz w:val="16"/>
-                <w:lang w:val="en-US"/>
-              </w:rPr>
-              <w:t xml:space="preserve"> bug report.</w:t>
+              <w:t>Empty fields are populated correctly, if already present conversion work to series is correct, but title is not changed. Awaiting reply on bug report.</w:t>
             </w:r>
           </w:p>
         </w:tc>
@@ -3362,25 +2486,7 @@
                 <w:sz w:val="16"/>
                 <w:lang w:val="en-US"/>
               </w:rPr>
-              <w:t xml:space="preserve">STILL REPRODUCES: </w:t>
-            </w:r>
-            <w:proofErr w:type="gramStart"/>
-            <w:r>
-              <w:rPr>
-                <w:rFonts w:ascii="Calibri" w:hAnsi="Calibri" w:cs="Calibri"/>
-                <w:sz w:val="16"/>
-                <w:lang w:val="en-US"/>
-              </w:rPr>
-              <w:t>orig-year</w:t>
-            </w:r>
-            <w:proofErr w:type="gramEnd"/>
-            <w:r>
-              <w:rPr>
-                <w:rFonts w:ascii="Calibri" w:hAnsi="Calibri" w:cs="Calibri"/>
-                <w:sz w:val="16"/>
-                <w:lang w:val="en-US"/>
-              </w:rPr>
-              <w:t xml:space="preserve"> becomes year.</w:t>
+              <w:t>STILL REPRODUCES: orig-year becomes year.</w:t>
             </w:r>
           </w:p>
         </w:tc>
@@ -3578,25 +2684,7 @@
                 <w:sz w:val="16"/>
                 <w:lang w:val="en-US"/>
               </w:rPr>
-              <w:t xml:space="preserve">NOT REPRODUCED: only </w:t>
-            </w:r>
-            <w:proofErr w:type="spellStart"/>
-            <w:r>
-              <w:rPr>
-                <w:rFonts w:ascii="Calibri" w:hAnsi="Calibri" w:cs="Calibri"/>
-                <w:sz w:val="16"/>
-                <w:lang w:val="en-US"/>
-              </w:rPr>
-              <w:t>doi</w:t>
-            </w:r>
-            <w:proofErr w:type="spellEnd"/>
-            <w:r>
-              <w:rPr>
-                <w:rFonts w:ascii="Calibri" w:hAnsi="Calibri" w:cs="Calibri"/>
-                <w:sz w:val="16"/>
-                <w:lang w:val="en-US"/>
-              </w:rPr>
-              <w:t>-access added.</w:t>
+              <w:t>NOT REPRODUCED: only doi-access added.</w:t>
             </w:r>
           </w:p>
         </w:tc>
@@ -3710,60 +2798,24 @@
                 <w:sz w:val="16"/>
                 <w:lang w:val="en-US"/>
               </w:rPr>
-              <w:t xml:space="preserve"> | </w:t>
-            </w:r>
-            <w:proofErr w:type="spellStart"/>
-            <w:r>
-              <w:rPr>
-                <w:rFonts w:ascii="Calibri" w:hAnsi="Calibri" w:cs="Calibri"/>
-                <w:sz w:val="16"/>
-                <w:lang w:val="en-US"/>
-              </w:rPr>
-              <w:t>doi</w:t>
-            </w:r>
-            <w:proofErr w:type="spellEnd"/>
-            <w:r>
-              <w:rPr>
-                <w:rFonts w:ascii="Calibri" w:hAnsi="Calibri" w:cs="Calibri"/>
-                <w:sz w:val="16"/>
-                <w:lang w:val="en-US"/>
-              </w:rPr>
-              <w:t xml:space="preserve"> = 10.7155/jgaa.00318</w:t>
-            </w:r>
-          </w:p>
-          <w:p>
-            <w:pPr>
-              <w:rPr>
-                <w:rFonts w:ascii="Calibri" w:hAnsi="Calibri" w:cs="Calibri"/>
-                <w:sz w:val="16"/>
-                <w:lang w:val="en-US"/>
-              </w:rPr>
-            </w:pPr>
-            <w:r>
-              <w:rPr>
-                <w:rFonts w:ascii="Calibri" w:hAnsi="Calibri" w:cs="Calibri"/>
-                <w:sz w:val="16"/>
-                <w:lang w:val="en-US"/>
-              </w:rPr>
-              <w:t xml:space="preserve"> | </w:t>
-            </w:r>
-            <w:proofErr w:type="spellStart"/>
-            <w:r>
-              <w:rPr>
-                <w:rFonts w:ascii="Calibri" w:hAnsi="Calibri" w:cs="Calibri"/>
-                <w:sz w:val="16"/>
-                <w:lang w:val="en-US"/>
-              </w:rPr>
-              <w:t>doi</w:t>
-            </w:r>
-            <w:proofErr w:type="spellEnd"/>
-            <w:r>
-              <w:rPr>
-                <w:rFonts w:ascii="Calibri" w:hAnsi="Calibri" w:cs="Calibri"/>
-                <w:sz w:val="16"/>
-                <w:lang w:val="en-US"/>
-              </w:rPr>
-              <w:t>-access = free</w:t>
+              <w:t xml:space="preserve"> | doi = 10.7155/jgaa.00318</w:t>
+            </w:r>
+          </w:p>
+          <w:p>
+            <w:pPr>
+              <w:rPr>
+                <w:rFonts w:ascii="Calibri" w:hAnsi="Calibri" w:cs="Calibri"/>
+                <w:sz w:val="16"/>
+                <w:lang w:val="en-US"/>
+              </w:rPr>
+            </w:pPr>
+            <w:r>
+              <w:rPr>
+                <w:rFonts w:ascii="Calibri" w:hAnsi="Calibri" w:cs="Calibri"/>
+                <w:sz w:val="16"/>
+                <w:lang w:val="en-US"/>
+              </w:rPr>
+              <w:t xml:space="preserve"> | doi-access = free</w:t>
             </w:r>
             <w:r>
               <w:rPr>
@@ -3818,41 +2870,13 @@
                 <w:lang w:val="en-US"/>
               </w:rPr>
             </w:pPr>
-            <w:proofErr w:type="spellStart"/>
-            <w:r>
-              <w:rPr>
-                <w:rFonts w:ascii="Calibri" w:hAnsi="Calibri" w:cs="Calibri"/>
-                <w:sz w:val="16"/>
-                <w:lang w:val="en-US"/>
-              </w:rPr>
-              <w:t>url</w:t>
-            </w:r>
-            <w:proofErr w:type="spellEnd"/>
-            <w:r>
-              <w:rPr>
-                <w:rFonts w:ascii="Calibri" w:hAnsi="Calibri" w:cs="Calibri"/>
-                <w:sz w:val="16"/>
-                <w:lang w:val="en-US"/>
-              </w:rPr>
-              <w:t xml:space="preserve"> should be contribution-</w:t>
-            </w:r>
-            <w:proofErr w:type="spellStart"/>
-            <w:r>
-              <w:rPr>
-                <w:rFonts w:ascii="Calibri" w:hAnsi="Calibri" w:cs="Calibri"/>
-                <w:sz w:val="16"/>
-                <w:lang w:val="en-US"/>
-              </w:rPr>
-              <w:t>url</w:t>
-            </w:r>
-            <w:proofErr w:type="spellEnd"/>
-            <w:r>
-              <w:rPr>
-                <w:rFonts w:ascii="Calibri" w:hAnsi="Calibri" w:cs="Calibri"/>
-                <w:sz w:val="16"/>
-                <w:lang w:val="en-US"/>
-              </w:rPr>
-              <w:t xml:space="preserve"> (https://en.wikipedia.org/wiki/Special:Diff/1335896006)</w:t>
+            <w:r>
+              <w:rPr>
+                <w:rFonts w:ascii="Calibri" w:hAnsi="Calibri" w:cs="Calibri"/>
+                <w:sz w:val="16"/>
+                <w:lang w:val="en-US"/>
+              </w:rPr>
+              <w:t>url should be contribution-url (https://en.wikipedia.org/wiki/Special:Diff/1335896006)</w:t>
             </w:r>
           </w:p>
         </w:tc>
@@ -3936,25 +2960,7 @@
                 <w:sz w:val="16"/>
                 <w:lang w:val="en-US"/>
               </w:rPr>
-              <w:t xml:space="preserve">| </w:t>
-            </w:r>
-            <w:proofErr w:type="spellStart"/>
-            <w:r>
-              <w:rPr>
-                <w:rFonts w:ascii="Calibri" w:hAnsi="Calibri" w:cs="Calibri"/>
-                <w:sz w:val="16"/>
-                <w:lang w:val="en-US"/>
-              </w:rPr>
-              <w:t>url</w:t>
-            </w:r>
-            <w:proofErr w:type="spellEnd"/>
-            <w:r>
-              <w:rPr>
-                <w:rFonts w:ascii="Calibri" w:hAnsi="Calibri" w:cs="Calibri"/>
-                <w:sz w:val="16"/>
-                <w:lang w:val="en-US"/>
-              </w:rPr>
-              <w:t xml:space="preserve"> = </w:t>
+              <w:t xml:space="preserve">| url = </w:t>
             </w:r>
             <w:hyperlink r:id="rId6" w:history="1">
               <w:r>
@@ -4063,39 +3069,7 @@
                 <w:rFonts w:ascii="Calibri" w:hAnsi="Calibri" w:cs="Calibri"/>
                 <w:sz w:val="16"/>
               </w:rPr>
-              <w:t>LIKELY FIXED: &lt;</w:t>
-            </w:r>
-            <w:proofErr w:type="spellStart"/>
-            <w:r>
-              <w:rPr>
-                <w:rFonts w:ascii="Calibri" w:hAnsi="Calibri" w:cs="Calibri"/>
-                <w:sz w:val="16"/>
-              </w:rPr>
-              <w:t>math</w:t>
-            </w:r>
-            <w:proofErr w:type="spellEnd"/>
-            <w:r>
-              <w:rPr>
-                <w:rFonts w:ascii="Calibri" w:hAnsi="Calibri" w:cs="Calibri"/>
-                <w:sz w:val="16"/>
-              </w:rPr>
-              <w:t xml:space="preserve">&gt; </w:t>
-            </w:r>
-            <w:proofErr w:type="spellStart"/>
-            <w:r>
-              <w:rPr>
-                <w:rFonts w:ascii="Calibri" w:hAnsi="Calibri" w:cs="Calibri"/>
-                <w:sz w:val="16"/>
-              </w:rPr>
-              <w:t>preserved</w:t>
-            </w:r>
-            <w:proofErr w:type="spellEnd"/>
-            <w:r>
-              <w:rPr>
-                <w:rFonts w:ascii="Calibri" w:hAnsi="Calibri" w:cs="Calibri"/>
-                <w:sz w:val="16"/>
-              </w:rPr>
-              <w:t>.</w:t>
+              <w:t>LIKELY FIXED: &lt;math&gt; preserved.</w:t>
             </w:r>
           </w:p>
         </w:tc>
@@ -4149,15 +3123,7 @@
                 <w:sz w:val="16"/>
                 <w:lang w:val="en-US"/>
               </w:rPr>
-              <w:t xml:space="preserve">however, </w:t>
-            </w:r>
-            <w:r>
-              <w:rPr>
-                <w:rFonts w:ascii="Calibri" w:hAnsi="Calibri" w:cs="Calibri"/>
-                <w:sz w:val="16"/>
-                <w:lang w:val="en-US"/>
-              </w:rPr>
-              <w:t xml:space="preserve">Further investigation: </w:t>
+              <w:t xml:space="preserve">however, Further investigation: </w:t>
             </w:r>
             <w:hyperlink r:id="rId7" w:history="1">
               <w:r>
@@ -4240,23 +3206,7 @@
                 <w:rFonts w:ascii="Calibri" w:hAnsi="Calibri" w:cs="Calibri"/>
                 <w:sz w:val="16"/>
               </w:rPr>
-              <w:t xml:space="preserve">LIKELY FIXED: volume=163 </w:t>
-            </w:r>
-            <w:proofErr w:type="spellStart"/>
-            <w:r>
-              <w:rPr>
-                <w:rFonts w:ascii="Calibri" w:hAnsi="Calibri" w:cs="Calibri"/>
-                <w:sz w:val="16"/>
-              </w:rPr>
-              <w:t>unchanged</w:t>
-            </w:r>
-            <w:proofErr w:type="spellEnd"/>
-            <w:r>
-              <w:rPr>
-                <w:rFonts w:ascii="Calibri" w:hAnsi="Calibri" w:cs="Calibri"/>
-                <w:sz w:val="16"/>
-              </w:rPr>
-              <w:t>.</w:t>
+              <w:t>LIKELY FIXED: volume=163 unchanged.</w:t>
             </w:r>
           </w:p>
         </w:tc>
@@ -4304,31 +3254,13 @@
               </w:rPr>
               <w:br/>
             </w:r>
-            <w:proofErr w:type="spellStart"/>
-            <w:r>
-              <w:rPr>
-                <w:rFonts w:ascii="Calibri" w:hAnsi="Calibri" w:cs="Calibri"/>
-                <w:sz w:val="16"/>
-                <w:lang w:val="en-US"/>
-              </w:rPr>
-              <w:t>behaviour</w:t>
-            </w:r>
-            <w:proofErr w:type="spellEnd"/>
-            <w:r>
-              <w:rPr>
-                <w:rFonts w:ascii="Calibri" w:hAnsi="Calibri" w:cs="Calibri"/>
-                <w:sz w:val="16"/>
-                <w:lang w:val="en-US"/>
-              </w:rPr>
-              <w:t xml:space="preserve"> now: </w:t>
-            </w:r>
-            <w:r>
-              <w:rPr>
-                <w:rFonts w:ascii="Calibri" w:hAnsi="Calibri" w:cs="Calibri"/>
-                <w:sz w:val="16"/>
-                <w:lang w:val="en-US"/>
-              </w:rPr>
-              <w:t>|volume</w:t>
+            <w:r>
+              <w:rPr>
+                <w:rFonts w:ascii="Calibri" w:hAnsi="Calibri" w:cs="Calibri"/>
+                <w:sz w:val="16"/>
+                <w:lang w:val="en-US"/>
+              </w:rPr>
+              <w:t>behaviour now: |volume</w:t>
             </w:r>
             <w:ins w:id="0" w:author="Unknown">
               <w:r>
@@ -4392,25 +3324,7 @@
                 <w:sz w:val="16"/>
                 <w:lang w:val="en-US"/>
               </w:rPr>
-              <w:t xml:space="preserve">malformed </w:t>
-            </w:r>
-            <w:proofErr w:type="spellStart"/>
-            <w:r>
-              <w:rPr>
-                <w:rFonts w:ascii="Calibri" w:hAnsi="Calibri" w:cs="Calibri"/>
-                <w:sz w:val="16"/>
-                <w:lang w:val="en-US"/>
-              </w:rPr>
-              <w:t>vauthors</w:t>
-            </w:r>
-            <w:proofErr w:type="spellEnd"/>
-            <w:r>
-              <w:rPr>
-                <w:rFonts w:ascii="Calibri" w:hAnsi="Calibri" w:cs="Calibri"/>
-                <w:sz w:val="16"/>
-                <w:lang w:val="en-US"/>
-              </w:rPr>
-              <w:t xml:space="preserve"> (https://en.wikipedia.org/wiki/Special:Diff/1347354919)</w:t>
+              <w:t>malformed vauthors (https://en.wikipedia.org/wiki/Special:Diff/1347354919)</w:t>
             </w:r>
           </w:p>
         </w:tc>
@@ -4432,25 +3346,7 @@
                 <w:sz w:val="16"/>
                 <w:lang w:val="en-US"/>
               </w:rPr>
-              <w:t xml:space="preserve">LIKELY FIXED: malformed </w:t>
-            </w:r>
-            <w:proofErr w:type="spellStart"/>
-            <w:r>
-              <w:rPr>
-                <w:rFonts w:ascii="Calibri" w:hAnsi="Calibri" w:cs="Calibri"/>
-                <w:sz w:val="16"/>
-                <w:lang w:val="en-US"/>
-              </w:rPr>
-              <w:t>vauthors</w:t>
-            </w:r>
-            <w:proofErr w:type="spellEnd"/>
-            <w:r>
-              <w:rPr>
-                <w:rFonts w:ascii="Calibri" w:hAnsi="Calibri" w:cs="Calibri"/>
-                <w:sz w:val="16"/>
-                <w:lang w:val="en-US"/>
-              </w:rPr>
-              <w:t xml:space="preserve"> not added.</w:t>
+              <w:t>LIKELY FIXED: malformed vauthors not added.</w:t>
             </w:r>
           </w:p>
         </w:tc>
@@ -4466,23 +3362,13 @@
                 <w:lang w:val="en-US"/>
               </w:rPr>
             </w:pPr>
-            <w:proofErr w:type="spellStart"/>
-            <w:r>
-              <w:rPr>
-                <w:rFonts w:ascii="Calibri" w:hAnsi="Calibri" w:cs="Calibri"/>
-                <w:sz w:val="16"/>
-                <w:lang w:val="en-US"/>
-              </w:rPr>
-              <w:t>Behaviour</w:t>
-            </w:r>
-            <w:proofErr w:type="spellEnd"/>
-            <w:r>
-              <w:rPr>
-                <w:rFonts w:ascii="Calibri" w:hAnsi="Calibri" w:cs="Calibri"/>
-                <w:sz w:val="16"/>
-                <w:lang w:val="en-US"/>
-              </w:rPr>
-              <w:t xml:space="preserve"> now: </w:t>
+            <w:r>
+              <w:rPr>
+                <w:rFonts w:ascii="Calibri" w:hAnsi="Calibri" w:cs="Calibri"/>
+                <w:sz w:val="16"/>
+                <w:lang w:val="en-US"/>
+              </w:rPr>
+              <w:t xml:space="preserve">Behaviour now: </w:t>
             </w:r>
             <w:r>
               <w:rPr>
@@ -4688,196 +3574,14 @@
               </w:rPr>
               <w:t xml:space="preserve"> which is for </w:t>
             </w:r>
-            <w:proofErr w:type="spellStart"/>
-            <w:r>
-              <w:rPr>
-                <w:rFonts w:ascii="Calibri" w:hAnsi="Calibri" w:cs="Calibri"/>
-                <w:sz w:val="16"/>
-                <w:lang w:val="en-US"/>
-              </w:rPr>
-              <w:t>Propuesta</w:t>
-            </w:r>
-            <w:proofErr w:type="spellEnd"/>
-            <w:r>
-              <w:rPr>
-                <w:rFonts w:ascii="Calibri" w:hAnsi="Calibri" w:cs="Calibri"/>
-                <w:sz w:val="16"/>
-                <w:lang w:val="en-US"/>
-              </w:rPr>
-              <w:t xml:space="preserve"> </w:t>
-            </w:r>
-            <w:proofErr w:type="spellStart"/>
-            <w:r>
-              <w:rPr>
-                <w:rFonts w:ascii="Calibri" w:hAnsi="Calibri" w:cs="Calibri"/>
-                <w:sz w:val="16"/>
-                <w:lang w:val="en-US"/>
-              </w:rPr>
-              <w:t>metodológica</w:t>
-            </w:r>
-            <w:proofErr w:type="spellEnd"/>
-            <w:r>
-              <w:rPr>
-                <w:rFonts w:ascii="Calibri" w:hAnsi="Calibri" w:cs="Calibri"/>
-                <w:sz w:val="16"/>
-                <w:lang w:val="en-US"/>
-              </w:rPr>
-              <w:t xml:space="preserve"> para el </w:t>
-            </w:r>
-            <w:proofErr w:type="spellStart"/>
-            <w:r>
-              <w:rPr>
-                <w:rFonts w:ascii="Calibri" w:hAnsi="Calibri" w:cs="Calibri"/>
-                <w:sz w:val="16"/>
-                <w:lang w:val="en-US"/>
-              </w:rPr>
-              <w:t>procesamiento</w:t>
-            </w:r>
-            <w:proofErr w:type="spellEnd"/>
-            <w:r>
-              <w:rPr>
-                <w:rFonts w:ascii="Calibri" w:hAnsi="Calibri" w:cs="Calibri"/>
-                <w:sz w:val="16"/>
-                <w:lang w:val="en-US"/>
-              </w:rPr>
-              <w:t xml:space="preserve"> de </w:t>
-            </w:r>
-            <w:proofErr w:type="spellStart"/>
-            <w:r>
-              <w:rPr>
-                <w:rFonts w:ascii="Calibri" w:hAnsi="Calibri" w:cs="Calibri"/>
-                <w:sz w:val="16"/>
-                <w:lang w:val="en-US"/>
-              </w:rPr>
-              <w:t>señales</w:t>
-            </w:r>
-            <w:proofErr w:type="spellEnd"/>
-            <w:r>
-              <w:rPr>
-                <w:rFonts w:ascii="Calibri" w:hAnsi="Calibri" w:cs="Calibri"/>
-                <w:sz w:val="16"/>
-                <w:lang w:val="en-US"/>
-              </w:rPr>
-              <w:t xml:space="preserve"> y videos </w:t>
-            </w:r>
-            <w:proofErr w:type="spellStart"/>
-            <w:r>
-              <w:rPr>
-                <w:rFonts w:ascii="Calibri" w:hAnsi="Calibri" w:cs="Calibri"/>
-                <w:sz w:val="16"/>
-                <w:lang w:val="en-US"/>
-              </w:rPr>
-              <w:t>aplicada</w:t>
-            </w:r>
-            <w:proofErr w:type="spellEnd"/>
-            <w:r>
-              <w:rPr>
-                <w:rFonts w:ascii="Calibri" w:hAnsi="Calibri" w:cs="Calibri"/>
-                <w:sz w:val="16"/>
-                <w:lang w:val="en-US"/>
-              </w:rPr>
-              <w:t xml:space="preserve"> a la </w:t>
-            </w:r>
-            <w:proofErr w:type="spellStart"/>
-            <w:r>
-              <w:rPr>
-                <w:rFonts w:ascii="Calibri" w:hAnsi="Calibri" w:cs="Calibri"/>
-                <w:sz w:val="16"/>
-                <w:lang w:val="en-US"/>
-              </w:rPr>
-              <w:t>detección</w:t>
-            </w:r>
-            <w:proofErr w:type="spellEnd"/>
-            <w:r>
-              <w:rPr>
-                <w:rFonts w:ascii="Calibri" w:hAnsi="Calibri" w:cs="Calibri"/>
-                <w:sz w:val="16"/>
-                <w:lang w:val="en-US"/>
-              </w:rPr>
-              <w:t xml:space="preserve"> y </w:t>
-            </w:r>
-            <w:proofErr w:type="spellStart"/>
-            <w:r>
-              <w:rPr>
-                <w:rFonts w:ascii="Calibri" w:hAnsi="Calibri" w:cs="Calibri"/>
-                <w:sz w:val="16"/>
-                <w:lang w:val="en-US"/>
-              </w:rPr>
-              <w:t>caracterización</w:t>
-            </w:r>
-            <w:proofErr w:type="spellEnd"/>
-            <w:r>
-              <w:rPr>
-                <w:rFonts w:ascii="Calibri" w:hAnsi="Calibri" w:cs="Calibri"/>
-                <w:sz w:val="16"/>
-                <w:lang w:val="en-US"/>
-              </w:rPr>
-              <w:t xml:space="preserve"> de la </w:t>
-            </w:r>
-            <w:proofErr w:type="spellStart"/>
-            <w:r>
-              <w:rPr>
-                <w:rFonts w:ascii="Calibri" w:hAnsi="Calibri" w:cs="Calibri"/>
-                <w:sz w:val="16"/>
-                <w:lang w:val="en-US"/>
-              </w:rPr>
-              <w:t>multiplicidad</w:t>
-            </w:r>
-            <w:proofErr w:type="spellEnd"/>
-            <w:r>
-              <w:rPr>
-                <w:rFonts w:ascii="Calibri" w:hAnsi="Calibri" w:cs="Calibri"/>
-                <w:sz w:val="16"/>
-                <w:lang w:val="en-US"/>
-              </w:rPr>
-              <w:t xml:space="preserve"> de </w:t>
-            </w:r>
-            <w:proofErr w:type="spellStart"/>
-            <w:r>
-              <w:rPr>
-                <w:rFonts w:ascii="Calibri" w:hAnsi="Calibri" w:cs="Calibri"/>
-                <w:sz w:val="16"/>
-                <w:lang w:val="en-US"/>
-              </w:rPr>
-              <w:t>descargas</w:t>
-            </w:r>
-            <w:proofErr w:type="spellEnd"/>
-            <w:r>
-              <w:rPr>
-                <w:rFonts w:ascii="Calibri" w:hAnsi="Calibri" w:cs="Calibri"/>
-                <w:sz w:val="16"/>
-                <w:lang w:val="en-US"/>
-              </w:rPr>
-              <w:t xml:space="preserve"> </w:t>
-            </w:r>
-            <w:proofErr w:type="spellStart"/>
-            <w:r>
-              <w:rPr>
-                <w:rFonts w:ascii="Calibri" w:hAnsi="Calibri" w:cs="Calibri"/>
-                <w:sz w:val="16"/>
-                <w:lang w:val="en-US"/>
-              </w:rPr>
-              <w:t>eléctricas</w:t>
-            </w:r>
-            <w:proofErr w:type="spellEnd"/>
-            <w:r>
-              <w:rPr>
-                <w:rFonts w:ascii="Calibri" w:hAnsi="Calibri" w:cs="Calibri"/>
-                <w:sz w:val="16"/>
-                <w:lang w:val="en-US"/>
-              </w:rPr>
-              <w:t xml:space="preserve"> </w:t>
-            </w:r>
-            <w:proofErr w:type="spellStart"/>
-            <w:r>
-              <w:rPr>
-                <w:rFonts w:ascii="Calibri" w:hAnsi="Calibri" w:cs="Calibri"/>
-                <w:sz w:val="16"/>
-                <w:lang w:val="en-US"/>
-              </w:rPr>
-              <w:t>atmosféricas</w:t>
-            </w:r>
-            <w:proofErr w:type="spellEnd"/>
+            <w:r>
+              <w:rPr>
+                <w:rFonts w:ascii="Calibri" w:hAnsi="Calibri" w:cs="Calibri"/>
+                <w:sz w:val="16"/>
+                <w:lang w:val="en-US"/>
+              </w:rPr>
+              <w:t>Propuesta metodológica para el procesamiento de señales y videos aplicada a la detección y caracterización de la multiplicidad de descargas eléctricas atmosféricas</w:t>
+            </w:r>
           </w:p>
           <w:p>
             <w:pPr>
@@ -5008,23 +3712,13 @@
               </w:rPr>
               <w:br/>
             </w:r>
-            <w:proofErr w:type="spellStart"/>
-            <w:r>
-              <w:rPr>
-                <w:rFonts w:ascii="Calibri" w:hAnsi="Calibri" w:cs="Calibri"/>
-                <w:sz w:val="16"/>
-                <w:lang w:val="en-US"/>
-              </w:rPr>
-              <w:t>Pubmed</w:t>
-            </w:r>
-            <w:proofErr w:type="spellEnd"/>
-            <w:r>
-              <w:rPr>
-                <w:rFonts w:ascii="Calibri" w:hAnsi="Calibri" w:cs="Calibri"/>
-                <w:sz w:val="16"/>
-                <w:lang w:val="en-US"/>
-              </w:rPr>
-              <w:t xml:space="preserve"> gives: Annu Rev Cell Dev Biol. 2024 Oct;40(1):143-168. Further investigation needed unless correct</w:t>
+            <w:r>
+              <w:rPr>
+                <w:rFonts w:ascii="Calibri" w:hAnsi="Calibri" w:cs="Calibri"/>
+                <w:sz w:val="16"/>
+                <w:lang w:val="en-US"/>
+              </w:rPr>
+              <w:t>Pubmed gives: Annu Rev Cell Dev Biol. 2024 Oct;40(1):143-168. Further investigation needed unless correct</w:t>
             </w:r>
           </w:p>
         </w:tc>
@@ -5062,23 +3756,13 @@
                 <w:lang w:val="en-US"/>
               </w:rPr>
             </w:pPr>
-            <w:proofErr w:type="spellStart"/>
-            <w:r>
-              <w:rPr>
-                <w:rFonts w:ascii="Calibri" w:hAnsi="Calibri" w:cs="Calibri"/>
-                <w:sz w:val="16"/>
-                <w:lang w:val="en-US"/>
-              </w:rPr>
-              <w:t>cookieAbsent</w:t>
-            </w:r>
-            <w:proofErr w:type="spellEnd"/>
-            <w:r>
-              <w:rPr>
-                <w:rFonts w:ascii="Calibri" w:hAnsi="Calibri" w:cs="Calibri"/>
-                <w:sz w:val="16"/>
-                <w:lang w:val="en-US"/>
-              </w:rPr>
-              <w:t xml:space="preserve"> (https://en.wikipedia.org/wiki/Special:Diff/1351798135), second example (https://en.wikipedia.org/wiki/Special:Diff/1351799610)</w:t>
+            <w:r>
+              <w:rPr>
+                <w:rFonts w:ascii="Calibri" w:hAnsi="Calibri" w:cs="Calibri"/>
+                <w:sz w:val="16"/>
+                <w:lang w:val="en-US"/>
+              </w:rPr>
+              <w:t>cookieAbsent (https://en.wikipedia.org/wiki/Special:Diff/1351798135), second example (https://en.wikipedia.org/wiki/Special:Diff/1351799610)</w:t>
             </w:r>
           </w:p>
         </w:tc>
@@ -5098,39 +3782,7 @@
                 <w:rFonts w:ascii="Calibri" w:hAnsi="Calibri" w:cs="Calibri"/>
                 <w:sz w:val="16"/>
               </w:rPr>
-              <w:t xml:space="preserve">UNRESOLVED CLEANUP: </w:t>
-            </w:r>
-            <w:proofErr w:type="spellStart"/>
-            <w:r>
-              <w:rPr>
-                <w:rFonts w:ascii="Calibri" w:hAnsi="Calibri" w:cs="Calibri"/>
-                <w:sz w:val="16"/>
-              </w:rPr>
-              <w:t>citations</w:t>
-            </w:r>
-            <w:proofErr w:type="spellEnd"/>
-            <w:r>
-              <w:rPr>
-                <w:rFonts w:ascii="Calibri" w:hAnsi="Calibri" w:cs="Calibri"/>
-                <w:sz w:val="16"/>
-              </w:rPr>
-              <w:t xml:space="preserve"> </w:t>
-            </w:r>
-            <w:proofErr w:type="spellStart"/>
-            <w:r>
-              <w:rPr>
-                <w:rFonts w:ascii="Calibri" w:hAnsi="Calibri" w:cs="Calibri"/>
-                <w:sz w:val="16"/>
-              </w:rPr>
-              <w:t>untouched</w:t>
-            </w:r>
-            <w:proofErr w:type="spellEnd"/>
-            <w:r>
-              <w:rPr>
-                <w:rFonts w:ascii="Calibri" w:hAnsi="Calibri" w:cs="Calibri"/>
-                <w:sz w:val="16"/>
-              </w:rPr>
-              <w:t>.</w:t>
+              <w:t>UNRESOLVED CLEANUP: citations untouched.</w:t>
             </w:r>
           </w:p>
         </w:tc>
@@ -5150,17 +3802,8 @@
                 <w:rFonts w:ascii="Calibri" w:hAnsi="Calibri" w:cs="Calibri"/>
                 <w:sz w:val="16"/>
               </w:rPr>
-              <w:t xml:space="preserve">Feature </w:t>
-            </w:r>
-            <w:proofErr w:type="spellStart"/>
-            <w:r>
-              <w:rPr>
-                <w:rFonts w:ascii="Calibri" w:hAnsi="Calibri" w:cs="Calibri"/>
-                <w:sz w:val="16"/>
-              </w:rPr>
-              <w:t>request</w:t>
-            </w:r>
-            <w:proofErr w:type="spellEnd"/>
+              <w:t>Feature request</w:t>
+            </w:r>
           </w:p>
         </w:tc>
       </w:tr>
@@ -5270,14 +3913,6 @@
                 <w:lang w:val="en-US"/>
               </w:rPr>
               <w:br/>
-            </w:r>
-            <w:proofErr w:type="spellStart"/>
-            <w:r>
-              <w:rPr>
-                <w:rFonts w:ascii="Calibri" w:hAnsi="Calibri" w:cs="Calibri"/>
-                <w:sz w:val="16"/>
-                <w:lang w:val="en-US"/>
-              </w:rPr>
               <w:t>d</w:t>
             </w:r>
             <w:r>
@@ -5286,16 +3921,7 @@
                 <w:sz w:val="16"/>
                 <w:lang w:val="en-US"/>
               </w:rPr>
-              <w:t>oi</w:t>
-            </w:r>
-            <w:proofErr w:type="spellEnd"/>
-            <w:r>
-              <w:rPr>
-                <w:rFonts w:ascii="Calibri" w:hAnsi="Calibri" w:cs="Calibri"/>
-                <w:sz w:val="16"/>
-                <w:lang w:val="en-US"/>
-              </w:rPr>
-              <w:t xml:space="preserve"> changed from </w:t>
+              <w:t xml:space="preserve">oi changed from </w:t>
             </w:r>
             <w:r>
               <w:rPr>
@@ -5313,23 +3939,13 @@
               </w:rPr>
               <w:t xml:space="preserve"> to </w:t>
             </w:r>
-            <w:proofErr w:type="spellStart"/>
-            <w:r>
-              <w:rPr>
-                <w:rFonts w:ascii="Calibri" w:hAnsi="Calibri" w:cs="Calibri"/>
-                <w:sz w:val="16"/>
-                <w:lang w:val="en-US"/>
-              </w:rPr>
-              <w:t>doi</w:t>
-            </w:r>
-            <w:proofErr w:type="spellEnd"/>
-            <w:r>
-              <w:rPr>
-                <w:rFonts w:ascii="Calibri" w:hAnsi="Calibri" w:cs="Calibri"/>
-                <w:sz w:val="16"/>
-                <w:lang w:val="en-US"/>
-              </w:rPr>
-              <w:t>=10.1097/01</w:t>
+            <w:r>
+              <w:rPr>
+                <w:rFonts w:ascii="Calibri" w:hAnsi="Calibri" w:cs="Calibri"/>
+                <w:sz w:val="16"/>
+                <w:lang w:val="en-US"/>
+              </w:rPr>
+              <w:t>doi=10.1097/01</w:t>
             </w:r>
             <w:r>
               <w:rPr>
@@ -5427,21 +4043,12 @@
                 <w:sz w:val="16"/>
               </w:rPr>
             </w:pPr>
-            <w:proofErr w:type="gramStart"/>
-            <w:r>
-              <w:rPr>
-                <w:rFonts w:ascii="Calibri" w:hAnsi="Calibri" w:cs="Calibri"/>
-                <w:sz w:val="16"/>
-              </w:rPr>
-              <w:t>DIFFERENT /</w:t>
-            </w:r>
-            <w:proofErr w:type="gramEnd"/>
-            <w:r>
-              <w:rPr>
-                <w:rFonts w:ascii="Calibri" w:hAnsi="Calibri" w:cs="Calibri"/>
-                <w:sz w:val="16"/>
-              </w:rPr>
-              <w:t xml:space="preserve"> AMBIGUOUS.</w:t>
+            <w:r>
+              <w:rPr>
+                <w:rFonts w:ascii="Calibri" w:hAnsi="Calibri" w:cs="Calibri"/>
+                <w:sz w:val="16"/>
+              </w:rPr>
+              <w:t>DIFFERENT / AMBIGUOUS.</w:t>
             </w:r>
           </w:p>
         </w:tc>
@@ -5655,39 +4262,7 @@
                 <w:rFonts w:ascii="Calibri" w:hAnsi="Calibri" w:cs="Calibri"/>
                 <w:sz w:val="16"/>
               </w:rPr>
-              <w:t xml:space="preserve">NOT REPRODUCED: </w:t>
-            </w:r>
-            <w:proofErr w:type="spellStart"/>
-            <w:r>
-              <w:rPr>
-                <w:rFonts w:ascii="Calibri" w:hAnsi="Calibri" w:cs="Calibri"/>
-                <w:sz w:val="16"/>
-              </w:rPr>
-              <w:t>formula</w:t>
-            </w:r>
-            <w:proofErr w:type="spellEnd"/>
-            <w:r>
-              <w:rPr>
-                <w:rFonts w:ascii="Calibri" w:hAnsi="Calibri" w:cs="Calibri"/>
-                <w:sz w:val="16"/>
-              </w:rPr>
-              <w:t xml:space="preserve"> </w:t>
-            </w:r>
-            <w:proofErr w:type="spellStart"/>
-            <w:r>
-              <w:rPr>
-                <w:rFonts w:ascii="Calibri" w:hAnsi="Calibri" w:cs="Calibri"/>
-                <w:sz w:val="16"/>
-              </w:rPr>
-              <w:t>preserved</w:t>
-            </w:r>
-            <w:proofErr w:type="spellEnd"/>
-            <w:r>
-              <w:rPr>
-                <w:rFonts w:ascii="Calibri" w:hAnsi="Calibri" w:cs="Calibri"/>
-                <w:sz w:val="16"/>
-              </w:rPr>
-              <w:t>.</w:t>
+              <w:t>NOT REPRODUCED: formula preserved.</w:t>
             </w:r>
           </w:p>
         </w:tc>
@@ -5729,16 +4304,7 @@
                 <w:sz w:val="16"/>
                 <w:lang w:val="en-US"/>
               </w:rPr>
-              <w:t>\</w:t>
-            </w:r>
-            <w:proofErr w:type="spellStart"/>
-            <w:r>
-              <w:rPr>
-                <w:rFonts w:ascii="Calibri" w:hAnsi="Calibri" w:cs="Calibri"/>
-                <w:sz w:val="16"/>
-                <w:lang w:val="en-US"/>
-              </w:rPr>
-              <w:t>mathbb</w:t>
+              <w:t>\mathbb</w:t>
             </w:r>
             <w:del w:id="3" w:author="Unknown">
               <w:r>
@@ -5780,7 +4346,6 @@
               </w:rPr>
               <w:t>^n</w:t>
             </w:r>
-            <w:proofErr w:type="spellEnd"/>
             <w:del w:id="5" w:author="Unknown">
               <w:r>
                 <w:rPr>
@@ -5819,16 +4384,7 @@
                 <w:sz w:val="16"/>
                 <w:lang w:val="en-US"/>
               </w:rPr>
-              <w:t>\</w:t>
-            </w:r>
-            <w:proofErr w:type="spellStart"/>
-            <w:r>
-              <w:rPr>
-                <w:rFonts w:ascii="Calibri" w:hAnsi="Calibri" w:cs="Calibri"/>
-                <w:sz w:val="16"/>
-                <w:lang w:val="en-US"/>
-              </w:rPr>
-              <w:t>mathbb</w:t>
+              <w:t>\mathbb</w:t>
             </w:r>
             <w:del w:id="7" w:author="Unknown">
               <w:r>
@@ -5888,16 +4444,7 @@
                 <w:sz w:val="16"/>
                 <w:lang w:val="en-US"/>
               </w:rPr>
-              <w:t>|year</w:t>
-            </w:r>
-            <w:proofErr w:type="spellEnd"/>
-            <w:r>
-              <w:rPr>
-                <w:rFonts w:ascii="Calibri" w:hAnsi="Calibri" w:cs="Calibri"/>
-                <w:sz w:val="16"/>
-                <w:lang w:val="en-US"/>
-              </w:rPr>
-              <w:t>=</w:t>
+              <w:t>|year=</w:t>
             </w:r>
             <w:del w:id="10" w:author="Unknown">
               <w:r>
@@ -5917,33 +4464,7 @@
                 <w:sz w:val="16"/>
                 <w:lang w:val="en-US"/>
               </w:rPr>
-              <w:t>|</w:t>
-            </w:r>
-            <w:proofErr w:type="spellStart"/>
-            <w:r>
-              <w:rPr>
-                <w:rFonts w:ascii="Calibri" w:hAnsi="Calibri" w:cs="Calibri"/>
-                <w:sz w:val="16"/>
-                <w:lang w:val="en-US"/>
-              </w:rPr>
-              <w:t>arxiv</w:t>
-            </w:r>
-            <w:proofErr w:type="spellEnd"/>
-            <w:r>
-              <w:rPr>
-                <w:rFonts w:ascii="Calibri" w:hAnsi="Calibri" w:cs="Calibri"/>
-                <w:sz w:val="16"/>
-                <w:lang w:val="en-US"/>
-              </w:rPr>
-              <w:t>=2205.09102}}</w:t>
-            </w:r>
-            <w:r>
-              <w:rPr>
-                <w:rFonts w:ascii="Calibri" w:hAnsi="Calibri" w:cs="Calibri"/>
-                <w:sz w:val="16"/>
-                <w:lang w:val="en-US"/>
-              </w:rPr>
-              <w:t xml:space="preserve"> </w:t>
+              <w:t xml:space="preserve">|arxiv=2205.09102}} </w:t>
             </w:r>
             <w:r>
               <w:rPr>
@@ -5979,18 +4500,8 @@
                 <w:sz w:val="16"/>
                 <w:lang w:val="en-US"/>
               </w:rPr>
-              <w:t>\</w:t>
-            </w:r>
-            <w:proofErr w:type="spellStart"/>
-            <w:r>
-              <w:rPr>
-                <w:rFonts w:ascii="Calibri" w:hAnsi="Calibri" w:cs="Calibri"/>
-                <w:sz w:val="16"/>
-                <w:lang w:val="en-US"/>
-              </w:rPr>
-              <w:t>mathbb</w:t>
-            </w:r>
-            <w:proofErr w:type="spellEnd"/>
+              <w:t>\mathbb</w:t>
+            </w:r>
             <w:ins w:id="12" w:author="Unknown">
               <w:r>
                 <w:rPr>
@@ -6069,18 +4580,8 @@
                 <w:sz w:val="16"/>
                 <w:lang w:val="en-US"/>
               </w:rPr>
-              <w:t>\</w:t>
-            </w:r>
-            <w:proofErr w:type="spellStart"/>
-            <w:r>
-              <w:rPr>
-                <w:rFonts w:ascii="Calibri" w:hAnsi="Calibri" w:cs="Calibri"/>
-                <w:sz w:val="16"/>
-                <w:lang w:val="en-US"/>
-              </w:rPr>
-              <w:t>mathbb</w:t>
-            </w:r>
-            <w:proofErr w:type="spellEnd"/>
+              <w:t>\mathbb</w:t>
+            </w:r>
             <w:ins w:id="16" w:author="Unknown">
               <w:r>
                 <w:rPr>
@@ -6150,29 +4651,7 @@
                   <w:sz w:val="16"/>
                   <w:lang w:val="en-US"/>
                 </w:rPr>
-                <w:t>2025|volume=234 |pages=71–188 |</w:t>
-              </w:r>
-              <w:proofErr w:type="spellStart"/>
-              <w:r>
-                <w:rPr>
-                  <w:rFonts w:ascii="Calibri" w:hAnsi="Calibri" w:cs="Calibri"/>
-                  <w:b/>
-                  <w:bCs/>
-                  <w:sz w:val="16"/>
-                  <w:lang w:val="en-US"/>
-                </w:rPr>
-                <w:t>doi</w:t>
-              </w:r>
-              <w:proofErr w:type="spellEnd"/>
-              <w:r>
-                <w:rPr>
-                  <w:rFonts w:ascii="Calibri" w:hAnsi="Calibri" w:cs="Calibri"/>
-                  <w:b/>
-                  <w:bCs/>
-                  <w:sz w:val="16"/>
-                  <w:lang w:val="en-US"/>
-                </w:rPr>
-                <w:t xml:space="preserve">=10.4310/ACTA.2025.v234.n1.a2 </w:t>
+                <w:t xml:space="preserve">2025|volume=234 |pages=71–188 |doi=10.4310/ACTA.2025.v234.n1.a2 </w:t>
               </w:r>
             </w:ins>
             <w:r>
@@ -6181,25 +4660,7 @@
                 <w:sz w:val="16"/>
                 <w:lang w:val="en-US"/>
               </w:rPr>
-              <w:t>|</w:t>
-            </w:r>
-            <w:proofErr w:type="spellStart"/>
-            <w:r>
-              <w:rPr>
-                <w:rFonts w:ascii="Calibri" w:hAnsi="Calibri" w:cs="Calibri"/>
-                <w:sz w:val="16"/>
-                <w:lang w:val="en-US"/>
-              </w:rPr>
-              <w:t>arxiv</w:t>
-            </w:r>
-            <w:proofErr w:type="spellEnd"/>
-            <w:r>
-              <w:rPr>
-                <w:rFonts w:ascii="Calibri" w:hAnsi="Calibri" w:cs="Calibri"/>
-                <w:sz w:val="16"/>
-                <w:lang w:val="en-US"/>
-              </w:rPr>
-              <w:t>=2205.09102}}&lt;/ref&gt;</w:t>
+              <w:t>|arxiv=2205.09102}}&lt;/ref&gt;</w:t>
             </w:r>
             <w:r>
               <w:rPr>
@@ -6252,33 +4713,13 @@
               </w:rPr>
               <w:t xml:space="preserve">   </w:t>
             </w:r>
-            <w:proofErr w:type="gramStart"/>
-            <w:r>
-              <w:rPr>
-                <w:rFonts w:ascii="Calibri" w:hAnsi="Calibri" w:cs="Calibri"/>
-                <w:sz w:val="16"/>
-                <w:lang w:val="en-US"/>
-              </w:rPr>
-              <w:t>!</w:t>
-            </w:r>
-            <w:proofErr w:type="spellStart"/>
-            <w:r>
-              <w:rPr>
-                <w:rFonts w:ascii="Calibri" w:hAnsi="Calibri" w:cs="Calibri"/>
-                <w:sz w:val="16"/>
-                <w:lang w:val="en-US"/>
-              </w:rPr>
-              <w:t>CrossRef</w:t>
-            </w:r>
-            <w:proofErr w:type="spellEnd"/>
-            <w:proofErr w:type="gramEnd"/>
-            <w:r>
-              <w:rPr>
-                <w:rFonts w:ascii="Calibri" w:hAnsi="Calibri" w:cs="Calibri"/>
-                <w:sz w:val="16"/>
-                <w:lang w:val="en-US"/>
-              </w:rPr>
-              <w:t xml:space="preserve"> title did not match existing title: doi:</w:t>
+            <w:r>
+              <w:rPr>
+                <w:rFonts w:ascii="Calibri" w:hAnsi="Calibri" w:cs="Calibri"/>
+                <w:sz w:val="16"/>
+                <w:lang w:val="en-US"/>
+              </w:rPr>
+              <w:t>!CrossRef title did not match existing title: doi:</w:t>
             </w:r>
             <w:hyperlink r:id="rId9" w:tgtFrame="_blank" w:history="1">
               <w:r>
@@ -6288,47 +4729,7 @@
                   <w:sz w:val="16"/>
                   <w:lang w:val="en-US"/>
                 </w:rPr>
-                <w:t>10.4310/</w:t>
-              </w:r>
-              <w:proofErr w:type="gramStart"/>
-              <w:r>
-                <w:rPr>
-                  <w:rStyle w:val="Hyperlink"/>
-                  <w:rFonts w:ascii="Calibri" w:hAnsi="Calibri" w:cs="Calibri"/>
-                  <w:sz w:val="16"/>
-                  <w:lang w:val="en-US"/>
-                </w:rPr>
-                <w:t>ACTA.2025.v</w:t>
-              </w:r>
-              <w:proofErr w:type="gramEnd"/>
-              <w:r>
-                <w:rPr>
-                  <w:rStyle w:val="Hyperlink"/>
-                  <w:rFonts w:ascii="Calibri" w:hAnsi="Calibri" w:cs="Calibri"/>
-                  <w:sz w:val="16"/>
-                  <w:lang w:val="en-US"/>
-                </w:rPr>
-                <w:t>234.n</w:t>
-              </w:r>
-              <w:proofErr w:type="gramStart"/>
-              <w:r>
-                <w:rPr>
-                  <w:rStyle w:val="Hyperlink"/>
-                  <w:rFonts w:ascii="Calibri" w:hAnsi="Calibri" w:cs="Calibri"/>
-                  <w:sz w:val="16"/>
-                  <w:lang w:val="en-US"/>
-                </w:rPr>
-                <w:t>1.a</w:t>
-              </w:r>
-              <w:proofErr w:type="gramEnd"/>
-              <w:r>
-                <w:rPr>
-                  <w:rStyle w:val="Hyperlink"/>
-                  <w:rFonts w:ascii="Calibri" w:hAnsi="Calibri" w:cs="Calibri"/>
-                  <w:sz w:val="16"/>
-                  <w:lang w:val="en-US"/>
-                </w:rPr>
-                <w:t>2</w:t>
+                <w:t>10.4310/ACTA.2025.v234.n1.a2</w:t>
               </w:r>
             </w:hyperlink>
           </w:p>
@@ -6346,43 +4747,7 @@
                 <w:sz w:val="16"/>
                 <w:lang w:val="en-US"/>
               </w:rPr>
-              <w:t xml:space="preserve">   &gt;Possible new title: The structure of isoperimetric bubbles on $&amp;#</w:t>
-            </w:r>
-            <w:proofErr w:type="gramStart"/>
-            <w:r>
-              <w:rPr>
-                <w:rFonts w:ascii="Calibri" w:hAnsi="Calibri" w:cs="Calibri"/>
-                <w:sz w:val="16"/>
-                <w:lang w:val="en-US"/>
-              </w:rPr>
-              <w:t>92;mathbb</w:t>
-            </w:r>
-            <w:proofErr w:type="gramEnd"/>
-            <w:r>
-              <w:rPr>
-                <w:rFonts w:ascii="Calibri" w:hAnsi="Calibri" w:cs="Calibri"/>
-                <w:sz w:val="16"/>
-                <w:lang w:val="en-US"/>
-              </w:rPr>
-              <w:t>{R}^n$ and $&amp;#</w:t>
-            </w:r>
-            <w:proofErr w:type="gramStart"/>
-            <w:r>
-              <w:rPr>
-                <w:rFonts w:ascii="Calibri" w:hAnsi="Calibri" w:cs="Calibri"/>
-                <w:sz w:val="16"/>
-                <w:lang w:val="en-US"/>
-              </w:rPr>
-              <w:t>92;mathbb</w:t>
-            </w:r>
-            <w:proofErr w:type="gramEnd"/>
-            <w:r>
-              <w:rPr>
-                <w:rFonts w:ascii="Calibri" w:hAnsi="Calibri" w:cs="Calibri"/>
-                <w:sz w:val="16"/>
-                <w:lang w:val="en-US"/>
-              </w:rPr>
-              <w:t>{S}^n$</w:t>
+              <w:t xml:space="preserve">   &gt;Possible new title: The structure of isoperimetric bubbles on $&amp;#92;mathbb{R}^n$ and $&amp;#92;mathbb{S}^n$</w:t>
             </w:r>
           </w:p>
           <w:p>
@@ -6596,17 +4961,8 @@
                 <w:rFonts w:ascii="Calibri" w:hAnsi="Calibri" w:cs="Calibri"/>
                 <w:sz w:val="16"/>
               </w:rPr>
-              <w:t xml:space="preserve">Feature </w:t>
-            </w:r>
-            <w:proofErr w:type="spellStart"/>
-            <w:r>
-              <w:rPr>
-                <w:rFonts w:ascii="Calibri" w:hAnsi="Calibri" w:cs="Calibri"/>
-                <w:sz w:val="16"/>
-              </w:rPr>
-              <w:t>request</w:t>
-            </w:r>
-            <w:proofErr w:type="spellEnd"/>
+              <w:t>Feature request</w:t>
+            </w:r>
           </w:p>
         </w:tc>
       </w:tr>
@@ -6711,17 +5067,8 @@
                 <w:sz w:val="16"/>
               </w:rPr>
               <w:lastRenderedPageBreak/>
-              <w:t xml:space="preserve">Feature </w:t>
-            </w:r>
-            <w:proofErr w:type="spellStart"/>
-            <w:r>
-              <w:rPr>
-                <w:rFonts w:ascii="Calibri" w:hAnsi="Calibri" w:cs="Calibri"/>
-                <w:sz w:val="16"/>
-              </w:rPr>
-              <w:t>request</w:t>
-            </w:r>
-            <w:proofErr w:type="spellEnd"/>
+              <w:t>Feature request</w:t>
+            </w:r>
           </w:p>
         </w:tc>
       </w:tr>
@@ -6748,18 +5095,8 @@
           <w:b/>
           <w:sz w:val="28"/>
         </w:rPr>
-        <w:t xml:space="preserve">Feature </w:t>
+        <w:t>Feature Requests</w:t>
       </w:r>
-      <w:proofErr w:type="spellStart"/>
-      <w:r>
-        <w:rPr>
-          <w:rFonts w:ascii="Calibri" w:hAnsi="Calibri"/>
-          <w:b/>
-          <w:sz w:val="28"/>
-        </w:rPr>
-        <w:t>Requests</w:t>
-      </w:r>
-      <w:proofErr w:type="spellEnd"/>
     </w:p>
     <w:tbl>
       <w:tblPr>
@@ -6795,7 +5132,6 @@
                 <w:sz w:val="16"/>
               </w:rPr>
             </w:pPr>
-            <w:proofErr w:type="spellStart"/>
             <w:r>
               <w:rPr>
                 <w:rFonts w:ascii="Calibri" w:hAnsi="Calibri" w:cs="Calibri"/>
@@ -6804,7 +5140,6 @@
               </w:rPr>
               <w:t>Request</w:t>
             </w:r>
-            <w:proofErr w:type="spellEnd"/>
           </w:p>
         </w:tc>
         <w:tc>
@@ -6819,34 +5154,14 @@
                 <w:sz w:val="16"/>
               </w:rPr>
             </w:pPr>
-            <w:proofErr w:type="spellStart"/>
             <w:r>
               <w:rPr>
                 <w:rFonts w:ascii="Calibri" w:hAnsi="Calibri" w:cs="Calibri"/>
                 <w:b/>
                 <w:sz w:val="16"/>
               </w:rPr>
-              <w:t>Provisional</w:t>
-            </w:r>
-            <w:proofErr w:type="spellEnd"/>
-            <w:r>
-              <w:rPr>
-                <w:rFonts w:ascii="Calibri" w:hAnsi="Calibri" w:cs="Calibri"/>
-                <w:b/>
-                <w:sz w:val="16"/>
-              </w:rPr>
-              <w:t xml:space="preserve"> </w:t>
-            </w:r>
-            <w:proofErr w:type="spellStart"/>
-            <w:r>
-              <w:rPr>
-                <w:rFonts w:ascii="Calibri" w:hAnsi="Calibri" w:cs="Calibri"/>
-                <w:b/>
-                <w:sz w:val="16"/>
-              </w:rPr>
-              <w:t>finding</w:t>
-            </w:r>
-            <w:proofErr w:type="spellEnd"/>
+              <w:t>Provisional finding</w:t>
+            </w:r>
           </w:p>
         </w:tc>
       </w:tr>
@@ -6867,49 +5182,8 @@
                 <w:rFonts w:ascii="Calibri" w:hAnsi="Calibri" w:cs="Calibri"/>
                 <w:sz w:val="16"/>
               </w:rPr>
-              <w:t xml:space="preserve">DOI </w:t>
-            </w:r>
-            <w:proofErr w:type="spellStart"/>
-            <w:r>
-              <w:rPr>
-                <w:rFonts w:ascii="Calibri" w:hAnsi="Calibri" w:cs="Calibri"/>
-                <w:sz w:val="16"/>
-              </w:rPr>
-              <w:t>to</w:t>
-            </w:r>
-            <w:proofErr w:type="spellEnd"/>
-            <w:r>
-              <w:rPr>
-                <w:rFonts w:ascii="Calibri" w:hAnsi="Calibri" w:cs="Calibri"/>
-                <w:sz w:val="16"/>
-              </w:rPr>
-              <w:t xml:space="preserve"> </w:t>
-            </w:r>
-            <w:proofErr w:type="spellStart"/>
-            <w:r>
-              <w:rPr>
-                <w:rFonts w:ascii="Calibri" w:hAnsi="Calibri" w:cs="Calibri"/>
-                <w:sz w:val="16"/>
-              </w:rPr>
-              <w:t>Who's</w:t>
-            </w:r>
-            <w:proofErr w:type="spellEnd"/>
-            <w:r>
-              <w:rPr>
-                <w:rFonts w:ascii="Calibri" w:hAnsi="Calibri" w:cs="Calibri"/>
-                <w:sz w:val="16"/>
-              </w:rPr>
-              <w:t xml:space="preserve"> </w:t>
-            </w:r>
-            <w:proofErr w:type="spellStart"/>
-            <w:r>
-              <w:rPr>
-                <w:rFonts w:ascii="Calibri" w:hAnsi="Calibri" w:cs="Calibri"/>
-                <w:sz w:val="16"/>
-              </w:rPr>
-              <w:t>Who</w:t>
-            </w:r>
-            <w:proofErr w:type="spellEnd"/>
+              <w:t>DOI to Who's Who</w:t>
+            </w:r>
           </w:p>
         </w:tc>
         <w:tc>
@@ -6954,25 +5228,7 @@
                 <w:sz w:val="16"/>
                 <w:lang w:val="en-US"/>
               </w:rPr>
-              <w:t xml:space="preserve">Convert cite web to </w:t>
-            </w:r>
-            <w:proofErr w:type="spellStart"/>
-            <w:r>
-              <w:rPr>
-                <w:rFonts w:ascii="Calibri" w:hAnsi="Calibri" w:cs="Calibri"/>
-                <w:sz w:val="16"/>
-                <w:lang w:val="en-US"/>
-              </w:rPr>
-              <w:t>BioRef</w:t>
-            </w:r>
-            <w:proofErr w:type="spellEnd"/>
-            <w:r>
-              <w:rPr>
-                <w:rFonts w:ascii="Calibri" w:hAnsi="Calibri" w:cs="Calibri"/>
-                <w:sz w:val="16"/>
-                <w:lang w:val="en-US"/>
-              </w:rPr>
-              <w:t>/GBIF</w:t>
+              <w:t>Convert cite web to BioRef/GBIF</w:t>
             </w:r>
           </w:p>
         </w:tc>
@@ -6992,23 +5248,7 @@
                 <w:rFonts w:ascii="Calibri" w:hAnsi="Calibri" w:cs="Calibri"/>
                 <w:sz w:val="16"/>
               </w:rPr>
-              <w:t xml:space="preserve">No </w:t>
-            </w:r>
-            <w:proofErr w:type="spellStart"/>
-            <w:r>
-              <w:rPr>
-                <w:rFonts w:ascii="Calibri" w:hAnsi="Calibri" w:cs="Calibri"/>
-                <w:sz w:val="16"/>
-              </w:rPr>
-              <w:t>implementation</w:t>
-            </w:r>
-            <w:proofErr w:type="spellEnd"/>
-            <w:r>
-              <w:rPr>
-                <w:rFonts w:ascii="Calibri" w:hAnsi="Calibri" w:cs="Calibri"/>
-                <w:sz w:val="16"/>
-              </w:rPr>
-              <w:t xml:space="preserve"> found.</w:t>
+              <w:t>No implementation found.</w:t>
             </w:r>
           </w:p>
         </w:tc>
@@ -7025,37 +5265,12 @@
                 <w:sz w:val="16"/>
               </w:rPr>
             </w:pPr>
-            <w:proofErr w:type="spellStart"/>
-            <w:r>
-              <w:rPr>
-                <w:rFonts w:ascii="Calibri" w:hAnsi="Calibri" w:cs="Calibri"/>
-                <w:sz w:val="16"/>
-              </w:rPr>
-              <w:t>Crossref</w:t>
-            </w:r>
-            <w:proofErr w:type="spellEnd"/>
-            <w:r>
-              <w:rPr>
-                <w:rFonts w:ascii="Calibri" w:hAnsi="Calibri" w:cs="Calibri"/>
-                <w:sz w:val="16"/>
-              </w:rPr>
-              <w:t xml:space="preserve"> </w:t>
-            </w:r>
-            <w:proofErr w:type="spellStart"/>
-            <w:r>
-              <w:rPr>
-                <w:rFonts w:ascii="Calibri" w:hAnsi="Calibri" w:cs="Calibri"/>
-                <w:sz w:val="16"/>
-              </w:rPr>
-              <w:t>Retraction</w:t>
-            </w:r>
-            <w:proofErr w:type="spellEnd"/>
-            <w:r>
-              <w:rPr>
-                <w:rFonts w:ascii="Calibri" w:hAnsi="Calibri" w:cs="Calibri"/>
-                <w:sz w:val="16"/>
-              </w:rPr>
-              <w:t xml:space="preserve"> Watch</w:t>
+            <w:r>
+              <w:rPr>
+                <w:rFonts w:ascii="Calibri" w:hAnsi="Calibri" w:cs="Calibri"/>
+                <w:sz w:val="16"/>
+              </w:rPr>
+              <w:t>Crossref Retraction Watch</w:t>
             </w:r>
           </w:p>
         </w:tc>
@@ -7075,23 +5290,7 @@
                 <w:rFonts w:ascii="Calibri" w:hAnsi="Calibri" w:cs="Calibri"/>
                 <w:sz w:val="16"/>
               </w:rPr>
-              <w:t xml:space="preserve">No </w:t>
-            </w:r>
-            <w:proofErr w:type="spellStart"/>
-            <w:r>
-              <w:rPr>
-                <w:rFonts w:ascii="Calibri" w:hAnsi="Calibri" w:cs="Calibri"/>
-                <w:sz w:val="16"/>
-              </w:rPr>
-              <w:t>implementation</w:t>
-            </w:r>
-            <w:proofErr w:type="spellEnd"/>
-            <w:r>
-              <w:rPr>
-                <w:rFonts w:ascii="Calibri" w:hAnsi="Calibri" w:cs="Calibri"/>
-                <w:sz w:val="16"/>
-              </w:rPr>
-              <w:t xml:space="preserve"> found.</w:t>
+              <w:t>No implementation found.</w:t>
             </w:r>
           </w:p>
         </w:tc>
@@ -7115,43 +5314,7 @@
                 <w:sz w:val="16"/>
                 <w:lang w:val="en-US"/>
               </w:rPr>
-              <w:t xml:space="preserve">Treat and </w:t>
-            </w:r>
-            <w:proofErr w:type="spellStart"/>
-            <w:r>
-              <w:rPr>
-                <w:rFonts w:ascii="Calibri" w:hAnsi="Calibri" w:cs="Calibri"/>
-                <w:sz w:val="16"/>
-                <w:lang w:val="en-US"/>
-              </w:rPr>
-              <w:t>and</w:t>
-            </w:r>
-            <w:proofErr w:type="spellEnd"/>
-            <w:r>
-              <w:rPr>
-                <w:rFonts w:ascii="Calibri" w:hAnsi="Calibri" w:cs="Calibri"/>
-                <w:sz w:val="16"/>
-                <w:lang w:val="en-US"/>
-              </w:rPr>
-              <w:t xml:space="preserve"> &amp; </w:t>
-            </w:r>
-            <w:proofErr w:type="spellStart"/>
-            <w:r>
-              <w:rPr>
-                <w:rFonts w:ascii="Calibri" w:hAnsi="Calibri" w:cs="Calibri"/>
-                <w:sz w:val="16"/>
-                <w:lang w:val="en-US"/>
-              </w:rPr>
-              <w:t>as</w:t>
-            </w:r>
-            <w:proofErr w:type="spellEnd"/>
-            <w:r>
-              <w:rPr>
-                <w:rFonts w:ascii="Calibri" w:hAnsi="Calibri" w:cs="Calibri"/>
-                <w:sz w:val="16"/>
-                <w:lang w:val="en-US"/>
-              </w:rPr>
-              <w:t xml:space="preserve"> equivalent</w:t>
+              <w:t>Treat and and &amp; as equivalent</w:t>
             </w:r>
           </w:p>
         </w:tc>
@@ -7173,25 +5336,7 @@
                 <w:sz w:val="16"/>
                 <w:lang w:val="en-US"/>
               </w:rPr>
-              <w:t xml:space="preserve">Partial normalization in </w:t>
-            </w:r>
-            <w:proofErr w:type="spellStart"/>
-            <w:r>
-              <w:rPr>
-                <w:rFonts w:ascii="Calibri" w:hAnsi="Calibri" w:cs="Calibri"/>
-                <w:sz w:val="16"/>
-                <w:lang w:val="en-US"/>
-              </w:rPr>
-              <w:t>TextTools.php</w:t>
-            </w:r>
-            <w:proofErr w:type="spellEnd"/>
-            <w:r>
-              <w:rPr>
-                <w:rFonts w:ascii="Calibri" w:hAnsi="Calibri" w:cs="Calibri"/>
-                <w:sz w:val="16"/>
-                <w:lang w:val="en-US"/>
-              </w:rPr>
-              <w:t>; example needs replay.</w:t>
+              <w:t>Partial normalization in TextTools.php; example needs replay.</w:t>
             </w:r>
           </w:p>
         </w:tc>
@@ -7235,23 +5380,7 @@
                 <w:rFonts w:ascii="Calibri" w:hAnsi="Calibri" w:cs="Calibri"/>
                 <w:sz w:val="16"/>
               </w:rPr>
-              <w:t xml:space="preserve">No </w:t>
-            </w:r>
-            <w:proofErr w:type="spellStart"/>
-            <w:r>
-              <w:rPr>
-                <w:rFonts w:ascii="Calibri" w:hAnsi="Calibri" w:cs="Calibri"/>
-                <w:sz w:val="16"/>
-              </w:rPr>
-              <w:t>dedicated</w:t>
-            </w:r>
-            <w:proofErr w:type="spellEnd"/>
-            <w:r>
-              <w:rPr>
-                <w:rFonts w:ascii="Calibri" w:hAnsi="Calibri" w:cs="Calibri"/>
-                <w:sz w:val="16"/>
-              </w:rPr>
-              <w:t xml:space="preserve"> feature found.</w:t>
+              <w:t>No dedicated feature found.</w:t>
             </w:r>
           </w:p>
         </w:tc>
@@ -7262,6 +5391,478 @@
         <w:rPr>
           <w:rFonts w:ascii="Calibri" w:hAnsi="Calibri"/>
           <w:sz w:val="18"/>
+        </w:rPr>
+      </w:pPr>
+    </w:p>
+    <w:p>
+      <w:pPr>
+        <w:rPr>
+          <w:rFonts w:ascii="Calibri" w:hAnsi="Calibri"/>
+          <w:sz w:val="18"/>
+        </w:rPr>
+      </w:pPr>
+      <w:r>
+        <w:rPr>
+          <w:rFonts w:ascii="Calibri" w:hAnsi="Calibri"/>
+          <w:sz w:val="18"/>
+        </w:rPr>
+        <w:br w:type="page"/>
+      </w:r>
+    </w:p>
+    <w:p>
+      <w:pPr>
+        <w:rPr>
+          <w:rFonts w:ascii="Calibri" w:hAnsi="Calibri" w:cs="Calibri"/>
+          <w:b/>
+          <w:sz w:val="32"/>
+        </w:rPr>
+      </w:pPr>
+      <w:r>
+        <w:rPr>
+          <w:rFonts w:ascii="Calibri" w:hAnsi="Calibri" w:cs="Calibri"/>
+          <w:b/>
+          <w:sz w:val="32"/>
+        </w:rPr>
+        <w:t>Assessment Decisions</w:t>
+      </w:r>
+    </w:p>
+    <w:p>
+      <w:pPr>
+        <w:rPr>
+          <w:rFonts w:ascii="Calibri" w:hAnsi="Calibri" w:cs="Calibri"/>
+          <w:i/>
+          <w:sz w:val="20"/>
+        </w:rPr>
+      </w:pPr>
+      <w:r>
+        <w:rPr>
+          <w:rFonts w:ascii="Calibri" w:hAnsi="Calibri" w:cs="Calibri"/>
+          <w:i/>
+          <w:sz w:val="20"/>
+        </w:rPr>
+        <w:t>Recorded after manual review of this DOCX. The manual notes in the worksheet tables above are authoritative.</w:t>
+      </w:r>
+    </w:p>
+    <w:p>
+      <w:pPr>
+        <w:rPr>
+          <w:rFonts w:ascii="Calibri" w:hAnsi="Calibri" w:cs="Calibri"/>
+          <w:b/>
+        </w:rPr>
+      </w:pPr>
+      <w:r>
+        <w:rPr>
+          <w:rFonts w:ascii="Calibri" w:hAnsi="Calibri" w:cs="Calibri"/>
+          <w:b/>
+        </w:rPr>
+        <w:t>Work on it</w:t>
+      </w:r>
+    </w:p>
+    <w:p>
+      <w:pPr>
+        <w:rPr>
+          <w:rFonts w:ascii="Calibri" w:hAnsi="Calibri" w:cs="Calibri"/>
+          <w:sz w:val="20"/>
+        </w:rPr>
+      </w:pPr>
+      <w:r>
+        <w:rPr>
+          <w:rFonts w:ascii="Calibri" w:hAnsi="Calibri" w:cs="Calibri"/>
+          <w:sz w:val="20"/>
+        </w:rPr>
+        <w:t>#7 - IAU Circular/CBET fields (article number handling; volume to issue when volume is present)</w:t>
+      </w:r>
+    </w:p>
+    <w:p>
+      <w:pPr>
+        <w:rPr>
+          <w:rFonts w:ascii="Calibri" w:hAnsi="Calibri" w:cs="Calibri"/>
+          <w:sz w:val="20"/>
+        </w:rPr>
+      </w:pPr>
+      <w:r>
+        <w:rPr>
+          <w:rFonts w:ascii="Calibri" w:hAnsi="Calibri" w:cs="Calibri"/>
+          <w:sz w:val="20"/>
+        </w:rPr>
+        <w:t>#10 - incorrect HDL added</w:t>
+      </w:r>
+    </w:p>
+    <w:p>
+      <w:pPr>
+        <w:rPr>
+          <w:rFonts w:ascii="Calibri" w:hAnsi="Calibri" w:cs="Calibri"/>
+          <w:sz w:val="20"/>
+        </w:rPr>
+      </w:pPr>
+      <w:r>
+        <w:rPr>
+          <w:rFonts w:ascii="Calibri" w:hAnsi="Calibri" w:cs="Calibri"/>
+          <w:sz w:val="20"/>
+        </w:rPr>
+        <w:t>#13 - Associated Press becomes Associated Press News</w:t>
+      </w:r>
+    </w:p>
+    <w:p>
+      <w:pPr>
+        <w:rPr>
+          <w:rFonts w:ascii="Calibri" w:hAnsi="Calibri" w:cs="Calibri"/>
+          <w:sz w:val="20"/>
+        </w:rPr>
+      </w:pPr>
+      <w:r>
+        <w:rPr>
+          <w:rFonts w:ascii="Calibri" w:hAnsi="Calibri" w:cs="Calibri"/>
+          <w:sz w:val="20"/>
+        </w:rPr>
+        <w:t>#14 - IAU Circular cleanup (with #7)</w:t>
+      </w:r>
+    </w:p>
+    <w:p>
+      <w:pPr>
+        <w:rPr>
+          <w:rFonts w:ascii="Calibri" w:hAnsi="Calibri" w:cs="Calibri"/>
+          <w:sz w:val="20"/>
+        </w:rPr>
+      </w:pPr>
+      <w:r>
+        <w:rPr>
+          <w:rFonts w:ascii="Calibri" w:hAnsi="Calibri" w:cs="Calibri"/>
+          <w:sz w:val="20"/>
+        </w:rPr>
+        <w:t>#27 - url should be contribution-url</w:t>
+      </w:r>
+    </w:p>
+    <w:p>
+      <w:pPr>
+        <w:rPr>
+          <w:rFonts w:ascii="Calibri" w:hAnsi="Calibri" w:cs="Calibri"/>
+          <w:sz w:val="20"/>
+        </w:rPr>
+      </w:pPr>
+      <w:r>
+        <w:rPr>
+          <w:rFonts w:ascii="Calibri" w:hAnsi="Calibri" w:cs="Calibri"/>
+          <w:sz w:val="20"/>
+        </w:rPr>
+        <w:t>#31 - unrelated thesis URL added from DOI</w:t>
+      </w:r>
+    </w:p>
+    <w:p>
+      <w:pPr>
+        <w:rPr>
+          <w:rFonts w:ascii="Calibri" w:hAnsi="Calibri" w:cs="Calibri"/>
+          <w:sz w:val="20"/>
+        </w:rPr>
+      </w:pPr>
+      <w:r>
+        <w:rPr>
+          <w:rFonts w:ascii="Calibri" w:hAnsi="Calibri" w:cs="Calibri"/>
+          <w:sz w:val="20"/>
+        </w:rPr>
+        <w:t>#33 - cookieAbsent cleanup (feature request)</w:t>
+      </w:r>
+    </w:p>
+    <w:p>
+      <w:pPr>
+        <w:rPr>
+          <w:rFonts w:ascii="Calibri" w:hAnsi="Calibri" w:cs="Calibri"/>
+          <w:sz w:val="20"/>
+        </w:rPr>
+      </w:pPr>
+      <w:r>
+        <w:rPr>
+          <w:rFonts w:ascii="Calibri" w:hAnsi="Calibri" w:cs="Calibri"/>
+          <w:sz w:val="20"/>
+        </w:rPr>
+        <w:t>#34 - DOI shortened/truncated</w:t>
+      </w:r>
+    </w:p>
+    <w:p>
+      <w:pPr>
+        <w:rPr>
+          <w:rFonts w:ascii="Calibri" w:hAnsi="Calibri" w:cs="Calibri"/>
+          <w:sz w:val="20"/>
+        </w:rPr>
+      </w:pPr>
+    </w:p>
+    <w:p>
+      <w:pPr>
+        <w:rPr>
+          <w:rFonts w:ascii="Calibri" w:hAnsi="Calibri" w:cs="Calibri"/>
+          <w:b/>
+        </w:rPr>
+      </w:pPr>
+      <w:r>
+        <w:rPr>
+          <w:rFonts w:ascii="Calibri" w:hAnsi="Calibri" w:cs="Calibri"/>
+          <w:b/>
+        </w:rPr>
+        <w:t>Investigate only</w:t>
+      </w:r>
+    </w:p>
+    <w:p>
+      <w:pPr>
+        <w:rPr>
+          <w:rFonts w:ascii="Calibri" w:hAnsi="Calibri" w:cs="Calibri"/>
+          <w:sz w:val="20"/>
+        </w:rPr>
+      </w:pPr>
+      <w:r>
+        <w:rPr>
+          <w:rFonts w:ascii="Calibri" w:hAnsi="Calibri" w:cs="Calibri"/>
+          <w:sz w:val="20"/>
+        </w:rPr>
+        <w:t>#17 - wrong URL / same-title collision</w:t>
+      </w:r>
+    </w:p>
+    <w:p>
+      <w:pPr>
+        <w:rPr>
+          <w:rFonts w:ascii="Calibri" w:hAnsi="Calibri" w:cs="Calibri"/>
+          <w:sz w:val="20"/>
+        </w:rPr>
+      </w:pPr>
+      <w:r>
+        <w:rPr>
+          <w:rFonts w:ascii="Calibri" w:hAnsi="Calibri" w:cs="Calibri"/>
+          <w:sz w:val="20"/>
+        </w:rPr>
+        <w:t>#22 - CABI inconsistency (identify behaviour)</w:t>
+      </w:r>
+    </w:p>
+    <w:p>
+      <w:pPr>
+        <w:rPr>
+          <w:rFonts w:ascii="Calibri" w:hAnsi="Calibri" w:cs="Calibri"/>
+          <w:sz w:val="20"/>
+        </w:rPr>
+      </w:pPr>
+      <w:r>
+        <w:rPr>
+          <w:rFonts w:ascii="Calibri" w:hAnsi="Calibri" w:cs="Calibri"/>
+          <w:sz w:val="20"/>
+        </w:rPr>
+        <w:t>#28 - math formatting removed from title</w:t>
+      </w:r>
+    </w:p>
+    <w:p>
+      <w:pPr>
+        <w:rPr>
+          <w:rFonts w:ascii="Calibri" w:hAnsi="Calibri" w:cs="Calibri"/>
+          <w:sz w:val="20"/>
+        </w:rPr>
+      </w:pPr>
+      <w:r>
+        <w:rPr>
+          <w:rFonts w:ascii="Calibri" w:hAnsi="Calibri" w:cs="Calibri"/>
+          <w:sz w:val="20"/>
+        </w:rPr>
+        <w:t>#29 - issue added equal to volume</w:t>
+      </w:r>
+    </w:p>
+    <w:p>
+      <w:pPr>
+        <w:rPr>
+          <w:rFonts w:ascii="Calibri" w:hAnsi="Calibri" w:cs="Calibri"/>
+          <w:sz w:val="20"/>
+        </w:rPr>
+      </w:pPr>
+      <w:r>
+        <w:rPr>
+          <w:rFonts w:ascii="Calibri" w:hAnsi="Calibri" w:cs="Calibri"/>
+          <w:sz w:val="20"/>
+        </w:rPr>
+        <w:t>#32 - spurious Annual Reviews issue</w:t>
+      </w:r>
+    </w:p>
+    <w:p>
+      <w:pPr>
+        <w:rPr>
+          <w:rFonts w:ascii="Calibri" w:hAnsi="Calibri" w:cs="Calibri"/>
+          <w:sz w:val="20"/>
+        </w:rPr>
+      </w:pPr>
+      <w:r>
+        <w:rPr>
+          <w:rFonts w:ascii="Calibri" w:hAnsi="Calibri" w:cs="Calibri"/>
+          <w:sz w:val="20"/>
+        </w:rPr>
+        <w:t>#37 - garbled math formula in title</w:t>
+      </w:r>
+    </w:p>
+    <w:p>
+      <w:pPr>
+        <w:rPr>
+          <w:rFonts w:ascii="Calibri" w:hAnsi="Calibri" w:cs="Calibri"/>
+          <w:sz w:val="20"/>
+        </w:rPr>
+      </w:pPr>
+    </w:p>
+    <w:p>
+      <w:pPr>
+        <w:rPr>
+          <w:rFonts w:ascii="Calibri" w:hAnsi="Calibri" w:cs="Calibri"/>
+          <w:b/>
+        </w:rPr>
+      </w:pPr>
+      <w:r>
+        <w:rPr>
+          <w:rFonts w:ascii="Calibri" w:hAnsi="Calibri" w:cs="Calibri"/>
+          <w:b/>
+        </w:rPr>
+        <w:t>Hold</w:t>
+      </w:r>
+    </w:p>
+    <w:p>
+      <w:pPr>
+        <w:rPr>
+          <w:rFonts w:ascii="Calibri" w:hAnsi="Calibri" w:cs="Calibri"/>
+          <w:sz w:val="20"/>
+        </w:rPr>
+      </w:pPr>
+      <w:r>
+        <w:rPr>
+          <w:rFonts w:ascii="Calibri" w:hAnsi="Calibri" w:cs="Calibri"/>
+          <w:sz w:val="20"/>
+        </w:rPr>
+        <w:t>#19 - awaiting reply on bug report</w:t>
+      </w:r>
+    </w:p>
+    <w:p>
+      <w:pPr>
+        <w:rPr>
+          <w:rFonts w:ascii="Calibri" w:hAnsi="Calibri" w:cs="Calibri"/>
+          <w:sz w:val="20"/>
+        </w:rPr>
+      </w:pPr>
+      <w:r>
+        <w:rPr>
+          <w:rFonts w:ascii="Calibri" w:hAnsi="Calibri" w:cs="Calibri"/>
+          <w:sz w:val="20"/>
+        </w:rPr>
+        <w:t>#38 - on-wiki discussion unresolved</w:t>
+      </w:r>
+    </w:p>
+    <w:p>
+      <w:pPr>
+        <w:rPr>
+          <w:rFonts w:ascii="Calibri" w:hAnsi="Calibri" w:cs="Calibri"/>
+          <w:sz w:val="20"/>
+        </w:rPr>
+      </w:pPr>
+      <w:r>
+        <w:rPr>
+          <w:rFonts w:ascii="Calibri" w:hAnsi="Calibri" w:cs="Calibri"/>
+          <w:sz w:val="20"/>
+        </w:rPr>
+        <w:t>#40 - awaiting reply; diff page deleted, new examples needed</w:t>
+      </w:r>
+    </w:p>
+    <w:p>
+      <w:pPr>
+        <w:rPr>
+          <w:rFonts w:ascii="Calibri" w:hAnsi="Calibri" w:cs="Calibri"/>
+          <w:sz w:val="20"/>
+        </w:rPr>
+      </w:pPr>
+    </w:p>
+    <w:p>
+      <w:pPr>
+        <w:rPr>
+          <w:rFonts w:ascii="Calibri" w:hAnsi="Calibri" w:cs="Calibri"/>
+          <w:b/>
+        </w:rPr>
+      </w:pPr>
+      <w:r>
+        <w:rPr>
+          <w:rFonts w:ascii="Calibri" w:hAnsi="Calibri" w:cs="Calibri"/>
+          <w:b/>
+        </w:rPr>
+        <w:t>Not now</w:t>
+      </w:r>
+    </w:p>
+    <w:p>
+      <w:pPr>
+        <w:rPr>
+          <w:rFonts w:ascii="Calibri" w:hAnsi="Calibri" w:cs="Calibri"/>
+          <w:sz w:val="20"/>
+        </w:rPr>
+      </w:pPr>
+      <w:r>
+        <w:rPr>
+          <w:rFonts w:ascii="Calibri" w:hAnsi="Calibri" w:cs="Calibri"/>
+          <w:sz w:val="20"/>
+        </w:rPr>
+        <w:t>Reports: #1, #2, #4, #5, #6, #8, #11, #12, #15, #18, #21, #26, #30, #35, #36, #39</w:t>
+      </w:r>
+    </w:p>
+    <w:p>
+      <w:pPr>
+        <w:rPr>
+          <w:rFonts w:ascii="Calibri" w:hAnsi="Calibri" w:cs="Calibri"/>
+          <w:sz w:val="20"/>
+        </w:rPr>
+      </w:pPr>
+      <w:r>
+        <w:rPr>
+          <w:rFonts w:ascii="Calibri" w:hAnsi="Calibri" w:cs="Calibri"/>
+          <w:sz w:val="20"/>
+        </w:rPr>
+        <w:t>Feature requests: DOI to Who's Who; cite web to BioRef/GBIF; Crossref Retraction Watch; and/&amp; equivalence; scholar.archive.org links</w:t>
+      </w:r>
+    </w:p>
+    <w:p>
+      <w:pPr>
+        <w:rPr>
+          <w:rFonts w:ascii="Calibri" w:hAnsi="Calibri" w:cs="Calibri"/>
+          <w:sz w:val="20"/>
+        </w:rPr>
+      </w:pPr>
+    </w:p>
+    <w:p>
+      <w:pPr>
+        <w:rPr>
+          <w:rFonts w:ascii="Calibri" w:hAnsi="Calibri" w:cs="Calibri"/>
+          <w:b/>
+        </w:rPr>
+      </w:pPr>
+      <w:r>
+        <w:rPr>
+          <w:rFonts w:ascii="Calibri" w:hAnsi="Calibri" w:cs="Calibri"/>
+          <w:b/>
+        </w:rPr>
+        <w:t>Conflict review</w:t>
+      </w:r>
+    </w:p>
+    <w:p>
+      <w:pPr>
+        <w:rPr>
+          <w:rFonts w:ascii="Calibri" w:hAnsi="Calibri" w:cs="Calibri"/>
+          <w:sz w:val="20"/>
+        </w:rPr>
+      </w:pPr>
+      <w:r>
+        <w:rPr>
+          <w:rFonts w:ascii="Calibri" w:hAnsi="Calibri" w:cs="Calibri"/>
+          <w:sz w:val="20"/>
+        </w:rPr>
+        <w:t>#1, #2, #4 were re-reviewed and remain skipped.</w:t>
+      </w:r>
+    </w:p>
+    <w:p>
+      <w:pPr>
+        <w:rPr>
+          <w:rFonts w:ascii="Calibri" w:hAnsi="Calibri" w:cs="Calibri"/>
+          <w:sz w:val="20"/>
+        </w:rPr>
+      </w:pPr>
+    </w:p>
+    <w:p>
+      <w:pPr>
+        <w:rPr>
+          <w:rFonts w:ascii="Calibri" w:hAnsi="Calibri" w:cs="Calibri"/>
+          <w:sz w:val="20"/>
         </w:rPr>
       </w:pPr>
     </w:p>
@@ -8035,6 +6636,7 @@
   <w:style w:type="character" w:default="1" w:styleId="Standaardalinea-lettertype">
     <w:name w:val="Default Paragraph Font"/>
     <w:uiPriority w:val="1"/>
+    <w:semiHidden/>
     <w:unhideWhenUsed/>
   </w:style>
   <w:style w:type="table" w:default="1" w:styleId="Standaardtabel">

</xml_diff>